<commit_message>
mu-Toni: Tony's line is "Has it got an appagator, is it a powerful tool?" (Settings page, design doc, manual script); Andy's backstory edit carried into the manual script
Version: v1.1.1410

Co-Authored-By: Claude Sonnet 5.5 <noreply@anthropic.com>
</commit_message>
<xml_diff>
--- a/docs/mu-toni/mu-Toni User Manual.docx
+++ b/docs/mu-toni/mu-Toni User Manual.docx
@@ -90,7 +90,51 @@
     </w:p>
     <w:p>
       <w:r>
-        <w:t>The name comes from Tony. However many times he was told that an arpeggiator was an arpeggiator, an Italian word, Tony always called them 'appagators'. The Settings page carries his line: Its an appagator, is it a powerful tool?</w:t>
+        <w:t xml:space="preserve">The name comes from </w:t>
+      </w:r>
+      <w:r>
+        <w:t>a customer of a music shop where I used to work in Bristol, his name was Tony</w:t>
+      </w:r>
+      <w:r>
+        <w:t xml:space="preserve">. </w:t>
+      </w:r>
+      <w:r>
+        <w:t>No matter how</w:t>
+      </w:r>
+      <w:r>
+        <w:t xml:space="preserve"> many times he was told that an arpeggiator was </w:t>
+      </w:r>
+      <w:r>
+        <w:t xml:space="preserve">called </w:t>
+      </w:r>
+      <w:r>
+        <w:t xml:space="preserve">an arpeggiator, an Italian word, Tony always called them 'appagators'. The Settings page carries his </w:t>
+      </w:r>
+      <w:r>
+        <w:t>often asked question</w:t>
+      </w:r>
+      <w:r>
+        <w:t xml:space="preserve">: </w:t>
+      </w:r>
+      <w:r>
+        <w:t>Has i</w:t>
+      </w:r>
+      <w:r>
+        <w:t xml:space="preserve">t </w:t>
+      </w:r>
+      <w:r>
+        <w:t xml:space="preserve">got </w:t>
+      </w:r>
+      <w:r>
+        <w:t>an appagator, is it a powerful tool?</w:t>
+      </w:r>
+      <w:r>
+        <w:t xml:space="preserve"> </w:t>
+      </w:r>
+    </w:p>
+    <w:p>
+      <w:r>
+        <w:t>Bless him, he was a bit special. I wonder what became of him.</w:t>
       </w:r>
     </w:p>
     <w:p>
@@ -101,6 +145,7 @@
         <w:rPr>
           <w:noProof/>
         </w:rPr>
+        <w:lastRenderedPageBreak/>
         <w:drawing>
           <wp:inline distT="0" distB="0" distL="0" distR="0" wp14:anchorId="051F5325" wp14:editId="711281D9">
             <wp:extent cx="5274310" cy="3340100"/>
@@ -149,8 +194,142 @@
         <w:rPr>
           <w:i/>
         </w:rPr>
+        <w:t>The mu-Toni window: transport bar, layer sidebar, sound sections and the Appergater.</w:t>
+      </w:r>
+    </w:p>
+    <w:p>
+      <w:pPr>
+        <w:pStyle w:val="Heading1"/>
+      </w:pPr>
+      <w:r>
+        <w:t>2. How the Arpeggiator Thinks</w:t>
+      </w:r>
+    </w:p>
+    <w:p>
+      <w:r>
+        <w:t>A traditional arpeggiator plays back a list of notes you gave it. mu-Toni stores no list. Every time a step comes round, it works out the note from the controls as they are at that moment: the scale, the chord, the root note, the number of octaves and the direction. That is why every one of these controls can be modulated, and why changing one reshapes the arpeggio on the very next step.</w:t>
+      </w:r>
+    </w:p>
+    <w:p>
+      <w:r>
+        <w:t>In plain steps:</w:t>
+      </w:r>
+    </w:p>
+    <w:p>
+      <w:pPr>
+        <w:pStyle w:val="ListBullet"/>
+      </w:pPr>
+      <w:r>
+        <w:t>The chord you pick (for example Minor 7th) supplies the notes to play: the root and the other chord tones above it.</w:t>
+      </w:r>
+    </w:p>
+    <w:p>
+      <w:pPr>
+        <w:pStyle w:val="ListBullet"/>
+      </w:pPr>
+      <w:r>
+        <w:t>Inversion re-voices the chord. A positive Inversion lifts the lowest notes up an octave; a negative one drops the highest notes down an octave.</w:t>
+      </w:r>
+    </w:p>
+    <w:p>
+      <w:pPr>
+        <w:pStyle w:val="ListBullet"/>
+      </w:pPr>
+      <w:r>
+        <w:t>Octaves stacks that set of notes over one to four octaves, starting from the root note and root octave.</w:t>
+      </w:r>
+    </w:p>
+    <w:p>
+      <w:pPr>
+        <w:pStyle w:val="ListBullet"/>
+      </w:pPr>
+      <w:r>
+        <w:t>Direction decides how the notes are visited, from always climbing, through up-and-down, to always falling.</w:t>
+      </w:r>
+    </w:p>
+    <w:p>
+      <w:pPr>
+        <w:pStyle w:val="ListBullet"/>
+      </w:pPr>
+      <w:r>
+        <w:t>Rate sets how fast the steps come, locked to the tempo.</w:t>
+      </w:r>
+    </w:p>
+    <w:p>
+      <w:r>
+        <w:t>mu-Toni plays one note at a time (it is monophonic). The chord only chooses which notes are in the pool; it is never sounded as a stacked chord. To hear several notes at once, add layers.</w:t>
+      </w:r>
+    </w:p>
+    <w:p>
+      <w:pPr>
+        <w:pStyle w:val="Heading1"/>
+      </w:pPr>
+      <w:r>
         <w:lastRenderedPageBreak/>
-        <w:t>The mu-Toni window: transport bar, layer sidebar, sound sections and the Appergater.</w:t>
+        <w:t>3. Installation</w:t>
+      </w:r>
+    </w:p>
+    <w:p>
+      <w:pPr>
+        <w:pStyle w:val="Heading2"/>
+      </w:pPr>
+      <w:r>
+        <w:t>Plug-in Files</w:t>
+      </w:r>
+    </w:p>
+    <w:p>
+      <w:r>
+        <w:t>mu-Toni ships in three formats:</w:t>
+      </w:r>
+    </w:p>
+    <w:p>
+      <w:pPr>
+        <w:pStyle w:val="ListBullet"/>
+      </w:pPr>
+      <w:r>
+        <w:t>VST3  —  copy mu-Toni.vst3 to %ProgramFiles%\Common Files\VST3\</w:t>
+      </w:r>
+    </w:p>
+    <w:p>
+      <w:pPr>
+        <w:pStyle w:val="ListBullet"/>
+      </w:pPr>
+      <w:r>
+        <w:t>CLAP  —  copy mu-Toni.clap to %ProgramFiles%\Common Files\CLAP\</w:t>
+      </w:r>
+    </w:p>
+    <w:p>
+      <w:pPr>
+        <w:pStyle w:val="ListBullet"/>
+      </w:pPr>
+      <w:r>
+        <w:t>Standalone  —  run mu-Toni.exe from any location</w:t>
+      </w:r>
+    </w:p>
+    <w:p>
+      <w:pPr>
+        <w:pStyle w:val="Heading2"/>
+      </w:pPr>
+      <w:r>
+        <w:t>Content Folder</w:t>
+      </w:r>
+    </w:p>
+    <w:p>
+      <w:r>
+        <w:t>On first launch mu-Toni creates a content folder at %USERPROFILE%\Documents\TDP\muToni\ with sub-folders for presets (full preset files, .muToni) and arps (single-layer preset files, .muArp).</w:t>
+      </w:r>
+    </w:p>
+    <w:p>
+      <w:pPr>
+        <w:pStyle w:val="Heading2"/>
+      </w:pPr>
+      <w:r>
+        <w:t>Free to Use</w:t>
+      </w:r>
+    </w:p>
+    <w:p>
+      <w:r>
+        <w:t>mu-Toni is free. It needs no licence key and never asks for payment.</w:t>
       </w:r>
     </w:p>
     <w:p>
@@ -158,140 +337,6 @@
         <w:pStyle w:val="Heading1"/>
       </w:pPr>
       <w:r>
-        <w:t>2. How the Arpeggiator Thinks</w:t>
-      </w:r>
-    </w:p>
-    <w:p>
-      <w:r>
-        <w:t>A traditional arpeggiator plays back a list of notes you gave it. mu-Toni stores no list. Every time a step comes round, it works out the note from the controls as they are at that moment: the scale, the chord, the root note, the number of octaves and the direction. That is why every one of these controls can be modulated, and why changing one reshapes the arpeggio on the very next step.</w:t>
-      </w:r>
-    </w:p>
-    <w:p>
-      <w:r>
-        <w:t>In plain steps:</w:t>
-      </w:r>
-    </w:p>
-    <w:p>
-      <w:pPr>
-        <w:pStyle w:val="ListBullet"/>
-      </w:pPr>
-      <w:r>
-        <w:t>The chord you pick (for example Minor 7th) supplies the notes to play: the root and the other chord tones above it.</w:t>
-      </w:r>
-    </w:p>
-    <w:p>
-      <w:pPr>
-        <w:pStyle w:val="ListBullet"/>
-      </w:pPr>
-      <w:r>
-        <w:t>Inversion re-voices the chord. A positive Inversion lifts the lowest notes up an octave; a negative one drops the highest notes down an octave.</w:t>
-      </w:r>
-    </w:p>
-    <w:p>
-      <w:pPr>
-        <w:pStyle w:val="ListBullet"/>
-      </w:pPr>
-      <w:r>
-        <w:t>Octaves stacks that set of notes over one to four octaves, starting from the root note and root octave.</w:t>
-      </w:r>
-    </w:p>
-    <w:p>
-      <w:pPr>
-        <w:pStyle w:val="ListBullet"/>
-      </w:pPr>
-      <w:r>
-        <w:t>Direction decides how the notes are visited, from always climbing, through up-and-down, to always falling.</w:t>
-      </w:r>
-    </w:p>
-    <w:p>
-      <w:pPr>
-        <w:pStyle w:val="ListBullet"/>
-      </w:pPr>
-      <w:r>
-        <w:t>Rate sets how fast the steps come, locked to the tempo.</w:t>
-      </w:r>
-    </w:p>
-    <w:p>
-      <w:r>
-        <w:t>mu-Toni plays one note at a time (it is monophonic). The chord only chooses which notes are in the pool; it is never sounded as a stacked chord. To hear several notes at once, add layers.</w:t>
-      </w:r>
-    </w:p>
-    <w:p>
-      <w:pPr>
-        <w:pStyle w:val="Heading1"/>
-      </w:pPr>
-      <w:r>
-        <w:t>3. Installation</w:t>
-      </w:r>
-    </w:p>
-    <w:p>
-      <w:pPr>
-        <w:pStyle w:val="Heading2"/>
-      </w:pPr>
-      <w:r>
-        <w:t>Plug-in Files</w:t>
-      </w:r>
-    </w:p>
-    <w:p>
-      <w:r>
-        <w:t>mu-Toni ships in three formats:</w:t>
-      </w:r>
-    </w:p>
-    <w:p>
-      <w:pPr>
-        <w:pStyle w:val="ListBullet"/>
-      </w:pPr>
-      <w:r>
-        <w:t>VST3  —  copy mu-Toni.vst3 to %ProgramFiles%\Common Files\VST3\</w:t>
-      </w:r>
-    </w:p>
-    <w:p>
-      <w:pPr>
-        <w:pStyle w:val="ListBullet"/>
-      </w:pPr>
-      <w:r>
-        <w:t>CLAP  —  copy mu-Toni.clap to %ProgramFiles%\Common Files\CLAP\</w:t>
-      </w:r>
-    </w:p>
-    <w:p>
-      <w:pPr>
-        <w:pStyle w:val="ListBullet"/>
-      </w:pPr>
-      <w:r>
-        <w:t>Standalone  —  run mu-Toni.exe from any location</w:t>
-      </w:r>
-    </w:p>
-    <w:p>
-      <w:pPr>
-        <w:pStyle w:val="Heading2"/>
-      </w:pPr>
-      <w:r>
-        <w:t>Content Folder</w:t>
-      </w:r>
-    </w:p>
-    <w:p>
-      <w:r>
-        <w:t>On first launch mu-Toni creates a content folder at %USERPROFILE%\Documents\TDP\muToni\ with sub-folders for presets (full preset files, .muToni) and arps (single-layer preset files, .muArp).</w:t>
-      </w:r>
-    </w:p>
-    <w:p>
-      <w:pPr>
-        <w:pStyle w:val="Heading2"/>
-      </w:pPr>
-      <w:r>
-        <w:t>Free to Use</w:t>
-      </w:r>
-    </w:p>
-    <w:p>
-      <w:r>
-        <w:t>mu-Toni is free. It needs no licence key and never asks for payment.</w:t>
-      </w:r>
-    </w:p>
-    <w:p>
-      <w:pPr>
-        <w:pStyle w:val="Heading1"/>
-      </w:pPr>
-      <w:r>
         <w:t>4. Interface Overview</w:t>
       </w:r>
     </w:p>
@@ -305,7 +350,6 @@
         <w:pStyle w:val="ListBullet"/>
       </w:pPr>
       <w:r>
-        <w:lastRenderedPageBreak/>
         <w:t>Transport Bar (top) — playback, BPM, presets, mixer, and settings</w:t>
       </w:r>
     </w:p>
@@ -354,6 +398,7 @@
         <w:rPr>
           <w:noProof/>
         </w:rPr>
+        <w:lastRenderedPageBreak/>
         <w:drawing>
           <wp:inline distT="0" distB="0" distL="0" distR="0" wp14:anchorId="59463120" wp14:editId="07A571FC">
             <wp:extent cx="5274310" cy="3340100"/>
@@ -447,16 +492,19 @@
         <w:pStyle w:val="ListBullet"/>
       </w:pPr>
       <w:r>
+        <w:t>Clock lamp  —  standalone only. Replaces the Tap button and sits between the BPM display and the Position readout, and appears only while MIDI clock sync is on with Messages set to Clock only or Clock + Transport (it is hidden with Transport only, and when Source is Internal). Dim amber means waiting for clock, green means locked to the clock, red means the clock was lost and the transport has stopped. The lamp stays steady; it never blinks. Hover over it to read its state in the status bar. See MIDI Clock Sync.</w:t>
+      </w:r>
+    </w:p>
+    <w:p>
+      <w:pPr>
+        <w:pStyle w:val="ListBullet"/>
+      </w:pPr>
+      <w:r>
+        <w:t xml:space="preserve">Tap button  —  standalone only. Takes the place of the Clock lamp whenever the lamp is not shown (the internal clock, or MIDI clock sync set to Transport only), so you see Tap or the lamp, never both. Tap it in time with the beat to set the tempo: it needs two taps, averages your last four intervals, and starts a new count if you </w:t>
+      </w:r>
+      <w:r>
         <w:lastRenderedPageBreak/>
-        <w:t>Clock lamp  —  standalone only. Replaces the Tap button and sits between the BPM display and the Position readout, and appears only while MIDI clock sync is on with Messages set to Clock only or Clock + Transport (it is hidden with Transport only, and when Source is Internal). Dim amber means waiting for clock, green means locked to the clock, red means the clock was lost and the transport has stopped. The lamp stays steady; it never blinks. Hover over it to read its state in the status bar. See MIDI Clock Sync.</w:t>
-      </w:r>
-    </w:p>
-    <w:p>
-      <w:pPr>
-        <w:pStyle w:val="ListBullet"/>
-      </w:pPr>
-      <w:r>
-        <w:t>Tap button  —  standalone only. Takes the place of the Clock lamp whenever the lamp is not shown (the internal clock, or MIDI clock sync set to Transport only), so you see Tap or the lamp, never both. Tap it in time with the beat to set the tempo: it needs two taps, averages your last four intervals, and starts a new count if you pause for more than two seconds. The result is rounded to a tenth of a BPM, kept within 20 to 300, and written into the BPM field.</w:t>
+        <w:t>pause for more than two seconds. The result is rounded to a tenth of a BPM, kept within 20 to 300, and written into the BPM field.</w:t>
       </w:r>
     </w:p>
     <w:p>
@@ -508,7 +556,7 @@
           <w:noProof/>
         </w:rPr>
         <w:drawing>
-          <wp:inline distT="0" distB="0" distL="0" distR="0" wp14:anchorId="0246AC3E" wp14:editId="0A1FF923">
+          <wp:inline distT="0" distB="0" distL="0" distR="0" wp14:anchorId="0246AC3E" wp14:editId="1124F1A5">
             <wp:extent cx="5274310" cy="126365"/>
             <wp:effectExtent l="0" t="0" r="2540" b="6985"/>
             <wp:docPr id="108478476" name="Picture 3"/>
@@ -592,7 +640,6 @@
         <w:pStyle w:val="ListBullet"/>
       </w:pPr>
       <w:r>
-        <w:lastRenderedPageBreak/>
         <w:t>Reorder  —  drag an item up or down. A layer keeps its settings and colour when it moves.</w:t>
       </w:r>
     </w:p>
@@ -609,6 +656,7 @@
         <w:rPr>
           <w:noProof/>
         </w:rPr>
+        <w:lastRenderedPageBreak/>
         <w:drawing>
           <wp:inline distT="0" distB="0" distL="0" distR="0" wp14:anchorId="6AAD25E5" wp14:editId="3EE99C0D">
             <wp:extent cx="446690" cy="4318000"/>
@@ -723,28 +771,28 @@
         <w:pStyle w:val="Heading2"/>
       </w:pPr>
       <w:r>
+        <w:t>Oscillator 1 and Oscillator 2</w:t>
+      </w:r>
+    </w:p>
+    <w:p>
+      <w:r>
+        <w:t>Each oscillator has a wavetable selector. mu-Toni uses the same wavetables as mu-Tant, with the Pos knob morphing through the table. Oscillator 1 has three knobs, Oscillator 2 has four:</w:t>
+      </w:r>
+    </w:p>
+    <w:p>
+      <w:pPr>
+        <w:pStyle w:val="ListBullet"/>
+      </w:pPr>
+      <w:r>
+        <w:t>Oct (-3 to +3 octaves) — octave offset from the arpeggiator's note</w:t>
+      </w:r>
+    </w:p>
+    <w:p>
+      <w:pPr>
+        <w:pStyle w:val="ListBullet"/>
+      </w:pPr>
+      <w:r>
         <w:lastRenderedPageBreak/>
-        <w:t>Oscillator 1 and Oscillator 2</w:t>
-      </w:r>
-    </w:p>
-    <w:p>
-      <w:r>
-        <w:t>Each oscillator has a wavetable selector. mu-Toni uses the same wavetables as mu-Tant, with the Pos knob morphing through the table. Oscillator 1 has three knobs, Oscillator 2 has four:</w:t>
-      </w:r>
-    </w:p>
-    <w:p>
-      <w:pPr>
-        <w:pStyle w:val="ListBullet"/>
-      </w:pPr>
-      <w:r>
-        <w:t>Oct (-3 to +3 octaves) — octave offset from the arpeggiator's note</w:t>
-      </w:r>
-    </w:p>
-    <w:p>
-      <w:pPr>
-        <w:pStyle w:val="ListBullet"/>
-      </w:pPr>
-      <w:r>
         <w:t>Semi (Oscillator 2 only, -12 to +12) — a semitone offset, to play a fixed interval against Oscillator 1</w:t>
       </w:r>
     </w:p>
@@ -901,39 +949,39 @@
         <w:pStyle w:val="Heading2"/>
       </w:pPr>
       <w:r>
+        <w:t>Filter</w:t>
+      </w:r>
+    </w:p>
+    <w:p>
+      <w:pPr>
+        <w:pStyle w:val="ListBullet"/>
+      </w:pPr>
+      <w:r>
+        <w:t>Type dropdown — sixteen filters: LP 6 / 12 / 24, HP 6 / 12 / 24, BP 12 / 24, Notch, Notch 24, AP 12, Comb +, Comb -, Peak, Lo Shf and Hi Shf.</w:t>
+      </w:r>
+    </w:p>
+    <w:p>
+      <w:pPr>
+        <w:pStyle w:val="ListBullet"/>
+      </w:pPr>
+      <w:r>
+        <w:t>Drive (0 to 100 percent) — valve saturation before the filter.</w:t>
+      </w:r>
+    </w:p>
+    <w:p>
+      <w:pPr>
+        <w:pStyle w:val="ListBullet"/>
+      </w:pPr>
+      <w:r>
+        <w:t>Cutoff (20 Hz to 18 kHz, default 3 kHz) and Reso (0 to 0.99, default 0.3).</w:t>
+      </w:r>
+    </w:p>
+    <w:p>
+      <w:pPr>
+        <w:pStyle w:val="ListBullet"/>
+      </w:pPr>
+      <w:r>
         <w:lastRenderedPageBreak/>
-        <w:t>Filter</w:t>
-      </w:r>
-    </w:p>
-    <w:p>
-      <w:pPr>
-        <w:pStyle w:val="ListBullet"/>
-      </w:pPr>
-      <w:r>
-        <w:t>Type dropdown — sixteen filters: LP 6 / 12 / 24, HP 6 / 12 / 24, BP 12 / 24, Notch, Notch 24, AP 12, Comb +, Comb -, Peak, Lo Shf and Hi Shf.</w:t>
-      </w:r>
-    </w:p>
-    <w:p>
-      <w:pPr>
-        <w:pStyle w:val="ListBullet"/>
-      </w:pPr>
-      <w:r>
-        <w:t>Drive (0 to 100 percent) — valve saturation before the filter.</w:t>
-      </w:r>
-    </w:p>
-    <w:p>
-      <w:pPr>
-        <w:pStyle w:val="ListBullet"/>
-      </w:pPr>
-      <w:r>
-        <w:t>Cutoff (20 Hz to 18 kHz, default 3 kHz) and Reso (0 to 0.99, default 0.3).</w:t>
-      </w:r>
-    </w:p>
-    <w:p>
-      <w:pPr>
-        <w:pStyle w:val="ListBullet"/>
-      </w:pPr>
-      <w:r>
         <w:t>Low Cut (0 to 1000 Hz, off at 0) — a high-pass after the filter that clears sub-bass build-up.</w:t>
       </w:r>
     </w:p>
@@ -1083,24 +1131,64 @@
         <w:pStyle w:val="ListBullet"/>
       </w:pPr>
       <w:r>
+        <w:t>Rate dropdown — the step length as a note value: 1/4, 1/8, 1/16 (the default) and 1/32, each also as a dotted value (for example 1/8.) and a triplet value (for example 1/8T). It follows the tempo.</w:t>
+      </w:r>
+    </w:p>
+    <w:p>
+      <w:pPr>
+        <w:pStyle w:val="ListBullet"/>
+      </w:pPr>
+      <w:r>
+        <w:t>Trigger dropdown — Loop (the default) or MIDI (see Playing with a Keyboard).</w:t>
+      </w:r>
+    </w:p>
+    <w:p>
+      <w:pPr>
+        <w:pStyle w:val="ListBullet"/>
+      </w:pPr>
+      <w:r>
+        <w:t>Legato and Snap toggles — see Gate, Legato and Glide, and Snap.</w:t>
+      </w:r>
+    </w:p>
+    <w:p>
+      <w:pPr>
+        <w:pStyle w:val="Heading2"/>
+      </w:pPr>
+      <w:r>
+        <w:t>Root, Octave, Inversion and Octaves</w:t>
+      </w:r>
+    </w:p>
+    <w:p>
+      <w:pPr>
+        <w:pStyle w:val="ListBullet"/>
+      </w:pPr>
+      <w:r>
+        <w:t>Root (0 to 11) — the root note, from C (0) up to B (11).</w:t>
+      </w:r>
+    </w:p>
+    <w:p>
+      <w:pPr>
+        <w:pStyle w:val="ListBullet"/>
+      </w:pPr>
+      <w:r>
         <w:lastRenderedPageBreak/>
-        <w:t>Rate dropdown — the step length as a note value: 1/4, 1/8, 1/16 (the default) and 1/32, each also as a dotted value (for example 1/8.) and a triplet value (for example 1/8T). It follows the tempo.</w:t>
-      </w:r>
-    </w:p>
-    <w:p>
-      <w:pPr>
-        <w:pStyle w:val="ListBullet"/>
-      </w:pPr>
-      <w:r>
-        <w:t>Trigger dropdown — Loop (the default) or MIDI (see Playing with a Keyboard).</w:t>
-      </w:r>
-    </w:p>
-    <w:p>
-      <w:pPr>
-        <w:pStyle w:val="ListBullet"/>
-      </w:pPr>
-      <w:r>
-        <w:t>Legato and Snap toggles — see Gate, Legato and Glide, and Snap.</w:t>
+        <w:t>Octave (0 to 8, default 4) — the octave the root sits in, which sets where the arpeggio starts.</w:t>
+      </w:r>
+    </w:p>
+    <w:p>
+      <w:pPr>
+        <w:pStyle w:val="ListBullet"/>
+      </w:pPr>
+      <w:r>
+        <w:t>Inversion (-4 to +4, default 0) — re-voices the chord. +1 moves the lowest note up an octave, +2 the lowest two, and so on. -1 moves the highest note down an octave, which gives wider, more open voicings. The setting is limited to what the chord has notes for.</w:t>
+      </w:r>
+    </w:p>
+    <w:p>
+      <w:pPr>
+        <w:pStyle w:val="ListBullet"/>
+      </w:pPr>
+      <w:r>
+        <w:t>Octaves (1 to 4, default 2) — how many octaves the chord tones are stacked over.</w:t>
       </w:r>
     </w:p>
     <w:p>
@@ -1108,39 +1196,12 @@
         <w:pStyle w:val="Heading2"/>
       </w:pPr>
       <w:r>
-        <w:t>Root, Octave, Inversion and Octaves</w:t>
-      </w:r>
-    </w:p>
-    <w:p>
-      <w:pPr>
-        <w:pStyle w:val="ListBullet"/>
-      </w:pPr>
-      <w:r>
-        <w:t>Root (0 to 11) — the root note, from C (0) up to B (11).</w:t>
-      </w:r>
-    </w:p>
-    <w:p>
-      <w:pPr>
-        <w:pStyle w:val="ListBullet"/>
-      </w:pPr>
-      <w:r>
-        <w:t>Octave (0 to 8, default 4) — the octave the root sits in, which sets where the arpeggio starts.</w:t>
-      </w:r>
-    </w:p>
-    <w:p>
-      <w:pPr>
-        <w:pStyle w:val="ListBullet"/>
-      </w:pPr>
-      <w:r>
-        <w:t>Inversion (-4 to +4, default 0) — re-voices the chord. +1 moves the lowest note up an octave, +2 the lowest two, and so on. -1 moves the highest note down an octave, which gives wider, more open voicings. The setting is limited to what the chord has notes for.</w:t>
-      </w:r>
-    </w:p>
-    <w:p>
-      <w:pPr>
-        <w:pStyle w:val="ListBullet"/>
-      </w:pPr>
-      <w:r>
-        <w:t>Octaves (1 to 4, default 2) — how many octaves the chord tones are stacked over.</w:t>
+        <w:t>Direction</w:t>
+      </w:r>
+    </w:p>
+    <w:p>
+      <w:r>
+        <w:t>Direction (-100 to +100, default +100) decides how the arpeggio travels through its notes. At +100 it climbs and starts again from the bottom, the classic up arpeggio. At -100 it falls. At 0 it climbs and falls equally, the up-and-down arpeggio. Values in between lean one way: +50 climbs through every note and comes down more quickly, skipping some notes. The pattern is exactly the same on every pass; nothing is random.</w:t>
       </w:r>
     </w:p>
     <w:p>
@@ -1148,12 +1209,65 @@
         <w:pStyle w:val="Heading2"/>
       </w:pPr>
       <w:r>
-        <w:t>Direction</w:t>
-      </w:r>
-    </w:p>
-    <w:p>
-      <w:r>
-        <w:t>Direction (-100 to +100, default +100) decides how the arpeggio travels through its notes. At +100 it climbs and starts again from the bottom, the classic up arpeggio. At -100 it falls. At 0 it climbs and falls equally, the up-and-down arpeggio. Values in between lean one way: +50 climbs through every note and comes down more quickly, skipping some notes. The pattern is exactly the same on every pass; nothing is random.</w:t>
+        <w:t>Gate, Legato and Glide</w:t>
+      </w:r>
+    </w:p>
+    <w:p>
+      <w:pPr>
+        <w:pStyle w:val="ListBullet"/>
+      </w:pPr>
+      <w:r>
+        <w:t>Gate (1 to 100 percent of the step, default 50) — how long each note is held before it is released. Short values are staccato; 100 percent joins the notes.</w:t>
+      </w:r>
+    </w:p>
+    <w:p>
+      <w:pPr>
+        <w:pStyle w:val="ListBullet"/>
+      </w:pPr>
+      <w:r>
+        <w:t>Legato toggle — when on, a note with Gate at 100 percent is tied to the next one: the envelopes are not restarted across the join.</w:t>
+      </w:r>
+    </w:p>
+    <w:p>
+      <w:pPr>
+        <w:pStyle w:val="ListBullet"/>
+      </w:pPr>
+      <w:r>
+        <w:t>Glide (0 to 500 milliseconds, default 0) — how long the pitch takes to slide from one note to the next. You hear glide only on tied notes.</w:t>
+      </w:r>
+    </w:p>
+    <w:p>
+      <w:r>
+        <w:t>So the three work together:</w:t>
+      </w:r>
+    </w:p>
+    <w:p>
+      <w:pPr>
+        <w:pStyle w:val="ListBullet"/>
+      </w:pPr>
+      <w:r>
+        <w:t>Legato on and Gate at 100 percent — tied notes that slide over the Glide time, like a 303 slide.</w:t>
+      </w:r>
+    </w:p>
+    <w:p>
+      <w:pPr>
+        <w:pStyle w:val="ListBullet"/>
+      </w:pPr>
+      <w:r>
+        <w:t>Legato on and Gate below 100 percent — separate plucked notes with gaps; no glide.</w:t>
+      </w:r>
+    </w:p>
+    <w:p>
+      <w:pPr>
+        <w:pStyle w:val="ListBullet"/>
+      </w:pPr>
+      <w:r>
+        <w:t>Legato off — every note is plucked; no glide, whatever Glide is set to.</w:t>
+      </w:r>
+    </w:p>
+    <w:p>
+      <w:r>
+        <w:t>To slide only on some steps, modulate Gate up to 100 percent on those steps with a stepped modulator.</w:t>
       </w:r>
     </w:p>
     <w:p>
@@ -1161,65 +1275,12 @@
         <w:pStyle w:val="Heading2"/>
       </w:pPr>
       <w:r>
-        <w:t>Gate, Legato and Glide</w:t>
-      </w:r>
-    </w:p>
-    <w:p>
-      <w:pPr>
-        <w:pStyle w:val="ListBullet"/>
-      </w:pPr>
-      <w:r>
-        <w:t>Gate (1 to 100 percent of the step, default 50) — how long each note is held before it is released. Short values are staccato; 100 percent joins the notes.</w:t>
-      </w:r>
-    </w:p>
-    <w:p>
-      <w:pPr>
-        <w:pStyle w:val="ListBullet"/>
-      </w:pPr>
-      <w:r>
-        <w:t>Legato toggle — when on, a note with Gate at 100 percent is tied to the next one: the envelopes are not restarted across the join.</w:t>
-      </w:r>
-    </w:p>
-    <w:p>
-      <w:pPr>
-        <w:pStyle w:val="ListBullet"/>
-      </w:pPr>
-      <w:r>
-        <w:t>Glide (0 to 500 milliseconds, default 0) — how long the pitch takes to slide from one note to the next. You hear glide only on tied notes.</w:t>
-      </w:r>
-    </w:p>
-    <w:p>
-      <w:r>
-        <w:t>So the three work together:</w:t>
-      </w:r>
-    </w:p>
-    <w:p>
-      <w:pPr>
-        <w:pStyle w:val="ListBullet"/>
-      </w:pPr>
-      <w:r>
-        <w:t>Legato on and Gate at 100 percent — tied notes that slide over the Glide time, like a 303 slide.</w:t>
-      </w:r>
-    </w:p>
-    <w:p>
-      <w:pPr>
-        <w:pStyle w:val="ListBullet"/>
-      </w:pPr>
-      <w:r>
-        <w:t>Legato on and Gate below 100 percent — separate plucked notes with gaps; no glide.</w:t>
-      </w:r>
-    </w:p>
-    <w:p>
-      <w:pPr>
-        <w:pStyle w:val="ListBullet"/>
-      </w:pPr>
-      <w:r>
-        <w:t>Legato off — every note is plucked; no glide, whatever Glide is set to.</w:t>
-      </w:r>
-    </w:p>
-    <w:p>
-      <w:r>
-        <w:t>To slide only on some steps, modulate Gate up to 100 percent on those steps with a stepped modulator.</w:t>
+        <w:t>Snap</w:t>
+      </w:r>
+    </w:p>
+    <w:p>
+      <w:r>
+        <w:t>With Snap on, every chord tone is moved to the nearest note of the chosen scale, so the arpeggio is always strictly in key. With Snap off (the default) the chord is played as named. In sparse scales, Snap can make two chord tones land on the same note.</w:t>
       </w:r>
     </w:p>
     <w:p>
@@ -1227,12 +1288,12 @@
         <w:pStyle w:val="Heading2"/>
       </w:pPr>
       <w:r>
-        <w:t>Snap</w:t>
-      </w:r>
-    </w:p>
-    <w:p>
-      <w:r>
-        <w:t>With Snap on, every chord tone is moved to the nearest note of the chosen scale, so the arpeggio is always strictly in key. With Snap off (the default) the chord is played as named. In sparse scales, Snap can make two chord tones land on the same note.</w:t>
+        <w:t>Accent</w:t>
+      </w:r>
+    </w:p>
+    <w:p>
+      <w:r>
+        <w:t>The row of cells at the right of the Appergater is the accent pattern. Acc Steps (1 to 16, default 4) sets how many cells it has, and you click a cell to switch that step's accent on or off. An accented step plays up to 6 dB louder, with the filter up to an octave brighter, scaled by the Accent knob (0 to 100 percent, default 0). A moving line shows which step the arpeggio is on. In Loop mode the pattern follows the beat, so accents stay locked to the bar; in MIDI mode it counts from each key press.</w:t>
       </w:r>
     </w:p>
     <w:p>
@@ -1241,19 +1302,6 @@
       </w:pPr>
       <w:r>
         <w:lastRenderedPageBreak/>
-        <w:t>Accent</w:t>
-      </w:r>
-    </w:p>
-    <w:p>
-      <w:r>
-        <w:t>The row of cells at the right of the Appergater is the accent pattern. Acc Steps (1 to 16, default 4) sets how many cells it has, and you click a cell to switch that step's accent on or off. An accented step plays up to 6 dB louder, with the filter up to an octave brighter, scaled by the Accent knob (0 to 100 percent, default 0). A moving line shows which step the arpeggio is on. In Loop mode the pattern follows the beat, so accents stay locked to the bar; in MIDI mode it counts from each key press.</w:t>
-      </w:r>
-    </w:p>
-    <w:p>
-      <w:pPr>
-        <w:pStyle w:val="Heading2"/>
-      </w:pPr>
-      <w:r>
         <w:t>Playing with a Keyboard</w:t>
       </w:r>
     </w:p>
@@ -1378,16 +1426,16 @@
     </w:p>
     <w:p>
       <w:r>
-        <w:t xml:space="preserve">Each modulator has a Mode dropdown (Stepped bar-graph or Smooth drawable curve), a Polarity switch (Uni 0 to +1, or Bi -1 to +1), and a loop length (a note-value dropdown times an integer multiplier). A playhead line shows the current loop position. In Smooth </w:t>
+        <w:t>Each modulator has a Mode dropdown (Stepped bar-graph or Smooth drawable curve), a Polarity switch (Uni 0 to +1, or Bi -1 to +1), and a loop length (a note-value dropdown times an integer multiplier). A playhead line shows the current loop position. In Smooth mode, click to add a node, drag to move, ALT-click a segment to bend it, right-click to remove. In Stepped mode, drag bars up or down. A dice button randomises the current modulator's values without changing its shape.</w:t>
+      </w:r>
+    </w:p>
+    <w:p>
+      <w:r>
+        <w:t xml:space="preserve">Add destinations with the + Target button; the assignments are shown one at a time, so step through them with the up and down arrows and the counter at the right. Each assignment has a bipolar depth (-100 to +100 percent) and a source-side curve. A modulator can move the arpeggio controls listed in the Appergater chapter, Osc 2 Semi, the oscillator positions and levels, the noise level, X-Mod Index, Depth and SSB shift, the </w:t>
       </w:r>
       <w:r>
         <w:lastRenderedPageBreak/>
-        <w:t>mode, click to add a node, drag to move, ALT-click a segment to bend it, right-click to remove. In Stepped mode, drag bars up or down. A dice button randomises the current modulator's values without changing its shape.</w:t>
-      </w:r>
-    </w:p>
-    <w:p>
-      <w:r>
-        <w:t>Add destinations with the + Target button; the assignments are shown one at a time, so step through them with the up and down arrows and the counter at the right. Each assignment has a bipolar depth (-100 to +100 percent) and a source-side curve. A modulator can move the arpeggio controls listed in the Appergater chapter, Osc 2 Semi, the oscillator positions and levels, the noise level, X-Mod Index, Depth and SSB shift, the filter's Cutoff, Resonance, Drive and Env Depth, the Amp Level and the Pitch Env depth. When a knob is a destination, an arc around it shows the live modulated value.</w:t>
+        <w:t>filter's Cutoff, Resonance, Drive and Env Depth, the Amp Level and the Pitch Env depth. When a knob is a destination, an arc around it shows the live modulated value.</w:t>
       </w:r>
     </w:p>
     <w:p>
@@ -1490,11 +1538,7 @@
         <w:pStyle w:val="ListBullet"/>
       </w:pPr>
       <w:r>
-        <w:t xml:space="preserve">Effect — Chorus (Rate, Depth, Voices, Spread), Flanger (Rate, Depth, Feedback), Phaser (Rate, Depth, Stages, Feedback) or Echo (Time, Feedback, Spread). The </w:t>
-      </w:r>
-      <w:r>
-        <w:lastRenderedPageBreak/>
-        <w:t>Effect is a pure send, like the Reverb, so it has no Mix knob; use each layer's Effect send.</w:t>
+        <w:t>Effect — Chorus (Rate, Depth, Voices, Spread), Flanger (Rate, Depth, Feedback), Phaser (Rate, Depth, Stages, Feedback) or Echo (Time, Feedback, Spread). The Effect is a pure send, like the Reverb, so it has no Mix knob; use each layer's Effect send.</w:t>
       </w:r>
     </w:p>
     <w:p>
@@ -1521,6 +1565,7 @@
         <w:rPr>
           <w:noProof/>
         </w:rPr>
+        <w:lastRenderedPageBreak/>
         <w:drawing>
           <wp:inline distT="0" distB="0" distL="0" distR="0" wp14:anchorId="3D06FABD" wp14:editId="42D88B85">
             <wp:extent cx="5274310" cy="3340100"/>
@@ -1616,33 +1661,33 @@
         <w:pStyle w:val="Heading1"/>
       </w:pPr>
       <w:r>
+        <w:t>14. Settings</w:t>
+      </w:r>
+    </w:p>
+    <w:p>
+      <w:r>
+        <w:t>Click the gear icon to open the Settings overlay. Everything fits on one screen, in two columns, under two headings. Click Close to return.</w:t>
+      </w:r>
+    </w:p>
+    <w:p>
+      <w:r>
+        <w:t>General (left column):</w:t>
+      </w:r>
+    </w:p>
+    <w:p>
+      <w:pPr>
+        <w:pStyle w:val="ListBullet"/>
+      </w:pPr>
+      <w:r>
+        <w:t>Audio, Master Vol — overall output level</w:t>
+      </w:r>
+    </w:p>
+    <w:p>
+      <w:pPr>
+        <w:pStyle w:val="ListBullet"/>
+      </w:pPr>
+      <w:r>
         <w:lastRenderedPageBreak/>
-        <w:t>14. Settings</w:t>
-      </w:r>
-    </w:p>
-    <w:p>
-      <w:r>
-        <w:t>Click the gear icon to open the Settings overlay. Everything fits on one screen, in two columns, under two headings. Click Close to return.</w:t>
-      </w:r>
-    </w:p>
-    <w:p>
-      <w:r>
-        <w:t>General (left column):</w:t>
-      </w:r>
-    </w:p>
-    <w:p>
-      <w:pPr>
-        <w:pStyle w:val="ListBullet"/>
-      </w:pPr>
-      <w:r>
-        <w:t>Audio, Master Vol — overall output level</w:t>
-      </w:r>
-    </w:p>
-    <w:p>
-      <w:pPr>
-        <w:pStyle w:val="ListBullet"/>
-      </w:pPr>
-      <w:r>
         <w:t>Display, Size — Medium or Large window. Reopen the app for the label fonts to rescale fully.</w:t>
       </w:r>
     </w:p>
@@ -1773,6 +1818,7 @@
         <w:pStyle w:val="ListBullet"/>
       </w:pPr>
       <w:r>
+        <w:lastRenderedPageBreak/>
         <w:t>Clock only  —  you start and stop mu-Toni with its own Play button, but the tempo and beat follow the clock's ticks. The BPM field is locked and shows the clock's tempo. The clock's Start and Stop messages are ignored.</w:t>
       </w:r>
     </w:p>
@@ -1854,7 +1900,11 @@
     </w:p>
     <w:p>
       <w:r>
-        <w:t>mu-Toni can load presets from incoming MIDI program-change messages. On channels 1 to 8 a program change loads the matching .muArp into that layer; on channel 9 it loads a full .muToni preset. While playing, the change is staged and applied seamlessly (hot-swap). Configure the mappings with the Layer Presets and Full Presets buttons in Settings, under MIDI Program Change.</w:t>
+        <w:t>mu-Toni can load presets from incoming MIDI program-change messages. On channels 1 to 8 a program change loads the matching .muArp into that layer; on channel 9 it loads a full .muToni preset. While playing, the change is staged and applied seamlessly (hot-</w:t>
+      </w:r>
+      <w:r>
+        <w:lastRenderedPageBreak/>
+        <w:t>swap). Configure the mappings with the Layer Presets and Full Presets buttons in Settings, under MIDI Program Change.</w:t>
       </w:r>
     </w:p>
     <w:p>
@@ -1984,6 +2034,7 @@
         <w:pStyle w:val="ListBullet"/>
       </w:pPr>
       <w:r>
+        <w:lastRenderedPageBreak/>
         <w:t>Evolving patterns: put a slow smooth modulator on Direction or on the filter Cutoff.</w:t>
       </w:r>
     </w:p>

</xml_diff>

<commit_message>
Stage 12: mu-Toni manual describes the Off / On / Accented step pattern
Refs #1603: manual text updated; appergater.png needs recapture after the batch build

Version: v1.1.1410

Co-Authored-By: Claude Sonnet 5.5 <noreply@anthropic.com>
</commit_message>
<xml_diff>
--- a/docs/mu-toni/mu-Toni User Manual.docx
+++ b/docs/mu-toni/mu-Toni User Manual.docx
@@ -90,46 +90,7 @@
     </w:p>
     <w:p>
       <w:r>
-        <w:t xml:space="preserve">The name comes from </w:t>
-      </w:r>
-      <w:r>
-        <w:t>a customer of a music shop where I used to work in Bristol, his name was Tony</w:t>
-      </w:r>
-      <w:r>
-        <w:t xml:space="preserve">. </w:t>
-      </w:r>
-      <w:r>
-        <w:t>No matter how</w:t>
-      </w:r>
-      <w:r>
-        <w:t xml:space="preserve"> many times he was told that an arpeggiator was </w:t>
-      </w:r>
-      <w:r>
-        <w:t xml:space="preserve">called </w:t>
-      </w:r>
-      <w:r>
-        <w:t xml:space="preserve">an arpeggiator, an Italian word, Tony always called them 'appagators'. The Settings page carries his </w:t>
-      </w:r>
-      <w:r>
-        <w:t>often asked question</w:t>
-      </w:r>
-      <w:r>
-        <w:t xml:space="preserve">: </w:t>
-      </w:r>
-      <w:r>
-        <w:t>Has i</w:t>
-      </w:r>
-      <w:r>
-        <w:t xml:space="preserve">t </w:t>
-      </w:r>
-      <w:r>
-        <w:t xml:space="preserve">got </w:t>
-      </w:r>
-      <w:r>
-        <w:t>an appagator, is it a powerful tool?</w:t>
-      </w:r>
-      <w:r>
-        <w:t xml:space="preserve"> </w:t>
+        <w:t xml:space="preserve">The name comes from a customer of a music shop where I used to work in Bristol, his name was Tony. No matter how many times he was told that an arpeggiator was called an arpeggiator, an Italian word, Tony always called them 'appagators'. The Settings page carries his often asked question: Has it got an appagator, is it a powerful tool? </w:t>
       </w:r>
     </w:p>
     <w:p>
@@ -147,10 +108,10 @@
         </w:rPr>
         <w:lastRenderedPageBreak/>
         <w:drawing>
-          <wp:inline distT="0" distB="0" distL="0" distR="0" wp14:anchorId="051F5325" wp14:editId="711281D9">
+          <wp:inline distT="0" distB="0" distL="0" distR="0" wp14:anchorId="1845FD8F" wp14:editId="4FD21AE6">
             <wp:extent cx="5274310" cy="3340100"/>
             <wp:effectExtent l="0" t="0" r="2540" b="0"/>
-            <wp:docPr id="638056851" name="Picture 1"/>
+            <wp:docPr id="822636463" name="Picture 1"/>
             <wp:cNvGraphicFramePr>
               <a:graphicFrameLocks xmlns:a="http://schemas.openxmlformats.org/drawingml/2006/main" noChangeAspect="1"/>
             </wp:cNvGraphicFramePr>
@@ -158,7 +119,7 @@
               <a:graphicData uri="http://schemas.openxmlformats.org/drawingml/2006/picture">
                 <pic:pic xmlns:pic="http://schemas.openxmlformats.org/drawingml/2006/picture">
                   <pic:nvPicPr>
-                    <pic:cNvPr id="638056851" name=""/>
+                    <pic:cNvPr id="822636463" name=""/>
                     <pic:cNvPicPr/>
                   </pic:nvPicPr>
                   <pic:blipFill>
@@ -400,10 +361,10 @@
         </w:rPr>
         <w:lastRenderedPageBreak/>
         <w:drawing>
-          <wp:inline distT="0" distB="0" distL="0" distR="0" wp14:anchorId="59463120" wp14:editId="07A571FC">
+          <wp:inline distT="0" distB="0" distL="0" distR="0" wp14:anchorId="139BD137" wp14:editId="70DFABE3">
             <wp:extent cx="5274310" cy="3340100"/>
             <wp:effectExtent l="0" t="0" r="2540" b="0"/>
-            <wp:docPr id="802425545" name="Picture 2"/>
+            <wp:docPr id="365798241" name="Picture 2"/>
             <wp:cNvGraphicFramePr>
               <a:graphicFrameLocks xmlns:a="http://schemas.openxmlformats.org/drawingml/2006/main" noChangeAspect="1"/>
             </wp:cNvGraphicFramePr>
@@ -411,7 +372,7 @@
               <a:graphicData uri="http://schemas.openxmlformats.org/drawingml/2006/picture">
                 <pic:pic xmlns:pic="http://schemas.openxmlformats.org/drawingml/2006/picture">
                   <pic:nvPicPr>
-                    <pic:cNvPr id="802425545" name=""/>
+                    <pic:cNvPr id="365798241" name=""/>
                     <pic:cNvPicPr/>
                   </pic:nvPicPr>
                   <pic:blipFill>
@@ -544,6 +505,14 @@
         <w:pStyle w:val="ListBullet"/>
       </w:pPr>
       <w:r>
+        <w:t>Perf button  —  standalone only. Sits between the Settings icon and the Mixer button and turns on Performance mode (also Ctrl+P). See Performance Mode in the Presets chapter.</w:t>
+      </w:r>
+    </w:p>
+    <w:p>
+      <w:pPr>
+        <w:pStyle w:val="ListBullet"/>
+      </w:pPr>
+      <w:r>
         <w:t>Mixer button  —  opens the mixer overlay. The label changes to Sequencer while the mixer is open.</w:t>
       </w:r>
     </w:p>
@@ -556,10 +525,10 @@
           <w:noProof/>
         </w:rPr>
         <w:drawing>
-          <wp:inline distT="0" distB="0" distL="0" distR="0" wp14:anchorId="0246AC3E" wp14:editId="1124F1A5">
+          <wp:inline distT="0" distB="0" distL="0" distR="0" wp14:anchorId="051476F2" wp14:editId="5D35B7F9">
             <wp:extent cx="5274310" cy="126365"/>
             <wp:effectExtent l="0" t="0" r="2540" b="6985"/>
-            <wp:docPr id="108478476" name="Picture 3"/>
+            <wp:docPr id="645702758" name="Picture 3"/>
             <wp:cNvGraphicFramePr>
               <a:graphicFrameLocks xmlns:a="http://schemas.openxmlformats.org/drawingml/2006/main" noChangeAspect="1"/>
             </wp:cNvGraphicFramePr>
@@ -567,7 +536,7 @@
               <a:graphicData uri="http://schemas.openxmlformats.org/drawingml/2006/picture">
                 <pic:pic xmlns:pic="http://schemas.openxmlformats.org/drawingml/2006/picture">
                   <pic:nvPicPr>
-                    <pic:cNvPr id="108478476" name=""/>
+                    <pic:cNvPr id="645702758" name=""/>
                     <pic:cNvPicPr/>
                   </pic:nvPicPr>
                   <pic:blipFill>
@@ -658,10 +627,10 @@
         </w:rPr>
         <w:lastRenderedPageBreak/>
         <w:drawing>
-          <wp:inline distT="0" distB="0" distL="0" distR="0" wp14:anchorId="6AAD25E5" wp14:editId="3EE99C0D">
+          <wp:inline distT="0" distB="0" distL="0" distR="0" wp14:anchorId="6F81AFBC" wp14:editId="40816FC7">
             <wp:extent cx="446690" cy="4318000"/>
             <wp:effectExtent l="0" t="0" r="0" b="6350"/>
-            <wp:docPr id="1044304751" name="Picture 4"/>
+            <wp:docPr id="1086835048" name="Picture 4"/>
             <wp:cNvGraphicFramePr>
               <a:graphicFrameLocks xmlns:a="http://schemas.openxmlformats.org/drawingml/2006/main" noChangeAspect="1"/>
             </wp:cNvGraphicFramePr>
@@ -669,7 +638,7 @@
               <a:graphicData uri="http://schemas.openxmlformats.org/drawingml/2006/picture">
                 <pic:pic xmlns:pic="http://schemas.openxmlformats.org/drawingml/2006/picture">
                   <pic:nvPicPr>
-                    <pic:cNvPr id="1044304751" name=""/>
+                    <pic:cNvPr id="1086835048" name=""/>
                     <pic:cNvPicPr/>
                   </pic:nvPicPr>
                   <pic:blipFill>
@@ -742,6 +711,14 @@
         <w:pStyle w:val="ListBullet"/>
       </w:pPr>
       <w:r>
+        <w:t>Clip strip — eight numbered pads that store and recall versions of this layer (see Clips in the Presets chapter).</w:t>
+      </w:r>
+    </w:p>
+    <w:p>
+      <w:pPr>
+        <w:pStyle w:val="ListBullet"/>
+      </w:pPr>
+      <w:r>
         <w:t>Save — saves this layer as a .muArp file.</w:t>
       </w:r>
     </w:p>
@@ -750,7 +727,7 @@
         <w:pStyle w:val="ListBullet"/>
       </w:pPr>
       <w:r>
-        <w:t>Reset (circular arrow) / Delete (×) — reset to defaults / remove the layer (both confirm first).</w:t>
+        <w:t>Reset (circular arrow) / Delete (×) — reset to defaults / remove the layer (both confirm first). Reset also clears the layer's clips, and its confirmation then says so.</w:t>
       </w:r>
     </w:p>
     <w:p>
@@ -784,6 +761,7 @@
         <w:pStyle w:val="ListBullet"/>
       </w:pPr>
       <w:r>
+        <w:lastRenderedPageBreak/>
         <w:t>Oct (-3 to +3 octaves) — octave offset from the arpeggiator's note</w:t>
       </w:r>
     </w:p>
@@ -792,187 +770,187 @@
         <w:pStyle w:val="ListBullet"/>
       </w:pPr>
       <w:r>
+        <w:t>Semi (Oscillator 2 only, -12 to +12) — a semitone offset, to play a fixed interval against Oscillator 1</w:t>
+      </w:r>
+    </w:p>
+    <w:p>
+      <w:pPr>
+        <w:pStyle w:val="ListBullet"/>
+      </w:pPr>
+      <w:r>
+        <w:t>Fine (plus or minus 100 cents) — detune. Oscillator 2 starts at +7 cents for a gentle thickening</w:t>
+      </w:r>
+    </w:p>
+    <w:p>
+      <w:pPr>
+        <w:pStyle w:val="ListBullet"/>
+      </w:pPr>
+      <w:r>
+        <w:t>Pos (0 to 255) — wavetable frame position; morphs through the table</w:t>
+      </w:r>
+    </w:p>
+    <w:p>
+      <w:pPr>
+        <w:pStyle w:val="Heading2"/>
+      </w:pPr>
+      <w:r>
+        <w:t>X-Mod</w:t>
+      </w:r>
+    </w:p>
+    <w:p>
+      <w:r>
+        <w:t>X-Mod lets Oscillator 2 modulate Oscillator 1, in two lanes that run together:</w:t>
+      </w:r>
+    </w:p>
+    <w:p>
+      <w:pPr>
+        <w:pStyle w:val="ListBullet"/>
+      </w:pPr>
+      <w:r>
+        <w:t>Phase mode dropdown — FM (frequency modulation), PM (phase modulation, the default; stays in tune) or TZFM (through-zero FM). The Index knob (0 to 100) sets how much.</w:t>
+      </w:r>
+    </w:p>
+    <w:p>
+      <w:pPr>
+        <w:pStyle w:val="ListBullet"/>
+      </w:pPr>
+      <w:r>
+        <w:t>Amplitude mode dropdown — AM (amplitude modulation, the default), RM (ring modulation) or SSB (single-sideband frequency shift). The Depth knob (-100 to +100, with off at the centre) sets how much; with SSB, the Shift knob (up to plus or minus 2 kHz) slides every partial by a fixed number of hertz.</w:t>
+      </w:r>
+    </w:p>
+    <w:p>
+      <w:pPr>
+        <w:pStyle w:val="ListBullet"/>
+      </w:pPr>
+      <w:r>
+        <w:t>Sync — hard-syncs Oscillator 2 to Oscillator 1 for a formant-like edge.</w:t>
+      </w:r>
+    </w:p>
+    <w:p>
+      <w:pPr>
+        <w:pStyle w:val="ListBullet"/>
+      </w:pPr>
+      <w:r>
+        <w:t>Fdbk — feedback: Oscillator 1 also modulates Oscillator 2, for grittier tones.</w:t>
+      </w:r>
+    </w:p>
+    <w:p>
+      <w:pPr>
+        <w:pStyle w:val="Heading2"/>
+      </w:pPr>
+      <w:r>
+        <w:t>Mix</w:t>
+      </w:r>
+    </w:p>
+    <w:p>
+      <w:r>
+        <w:t>The Mix box sets the balance before the filter:</w:t>
+      </w:r>
+    </w:p>
+    <w:p>
+      <w:pPr>
+        <w:pStyle w:val="ListBullet"/>
+      </w:pPr>
+      <w:r>
+        <w:t>Noise type dropdown — White or Pink.</w:t>
+      </w:r>
+    </w:p>
+    <w:p>
+      <w:pPr>
+        <w:pStyle w:val="ListBullet"/>
+      </w:pPr>
+      <w:r>
+        <w:t>Osc 1 and Osc 2 — the level of each oscillator (-60 to +6 dB).</w:t>
+      </w:r>
+    </w:p>
+    <w:p>
+      <w:pPr>
+        <w:pStyle w:val="ListBullet"/>
+      </w:pPr>
+      <w:r>
+        <w:t>Noise — the noise level (-60 to 0 dB; the default of -60 dB is off).</w:t>
+      </w:r>
+    </w:p>
+    <w:p>
+      <w:pPr>
+        <w:pStyle w:val="Heading1"/>
+      </w:pPr>
+      <w:r>
+        <w:t>9. Pitch, Filter, Amp and Effects</w:t>
+      </w:r>
+    </w:p>
+    <w:p>
+      <w:r>
+        <w:t>The second row has four boxes. Each of the first three has an ADSR envelope. Envelope times run from 1 millisecond to 4 seconds. Every note the arpeggiator plays starts these envelopes, except a tied (legato) note, which carries on (see Gate, Legato and Glide). The knob labels are fixed words with no units; the Status Bar shows the value and its units as you hover or turn.</w:t>
+      </w:r>
+    </w:p>
+    <w:p>
+      <w:pPr>
+        <w:pStyle w:val="Heading2"/>
+      </w:pPr>
+      <w:r>
+        <w:t>Pitch</w:t>
+      </w:r>
+    </w:p>
+    <w:p>
+      <w:r>
+        <w:t>The pitch envelope adds a short blip or slide to the start of each note.</w:t>
+      </w:r>
+    </w:p>
+    <w:p>
+      <w:pPr>
+        <w:pStyle w:val="ListBullet"/>
+      </w:pPr>
+      <w:r>
+        <w:t>Target dropdown — which oscillators the envelope moves: Osc 1+2, or Osc 2 only (the default).</w:t>
+      </w:r>
+    </w:p>
+    <w:p>
+      <w:pPr>
+        <w:pStyle w:val="ListBullet"/>
+      </w:pPr>
+      <w:r>
+        <w:t>Depth (-24 to +24 semitones, default 0). At 0 the envelope does nothing.</w:t>
+      </w:r>
+    </w:p>
+    <w:p>
+      <w:pPr>
+        <w:pStyle w:val="ListBullet"/>
+      </w:pPr>
+      <w:r>
+        <w:t>A, D, S, R — attack, decay, sustain and release.</w:t>
+      </w:r>
+    </w:p>
+    <w:p>
+      <w:pPr>
+        <w:pStyle w:val="Heading2"/>
+      </w:pPr>
+      <w:r>
+        <w:t>Filter</w:t>
+      </w:r>
+    </w:p>
+    <w:p>
+      <w:pPr>
+        <w:pStyle w:val="ListBullet"/>
+      </w:pPr>
+      <w:r>
+        <w:t>Type dropdown — sixteen filters: LP 6 / 12 / 24, HP 6 / 12 / 24, BP 12 / 24, Notch, Notch 24, AP 12, Comb +, Comb -, Peak, Lo Shf and Hi Shf.</w:t>
+      </w:r>
+    </w:p>
+    <w:p>
+      <w:pPr>
+        <w:pStyle w:val="ListBullet"/>
+      </w:pPr>
+      <w:r>
+        <w:t>Drive (0 to 100 percent) — valve saturation before the filter.</w:t>
+      </w:r>
+    </w:p>
+    <w:p>
+      <w:pPr>
+        <w:pStyle w:val="ListBullet"/>
+      </w:pPr>
+      <w:r>
         <w:lastRenderedPageBreak/>
-        <w:t>Semi (Oscillator 2 only, -12 to +12) — a semitone offset, to play a fixed interval against Oscillator 1</w:t>
-      </w:r>
-    </w:p>
-    <w:p>
-      <w:pPr>
-        <w:pStyle w:val="ListBullet"/>
-      </w:pPr>
-      <w:r>
-        <w:t>Fine (plus or minus 100 cents) — detune. Oscillator 2 starts at +7 cents for a gentle thickening</w:t>
-      </w:r>
-    </w:p>
-    <w:p>
-      <w:pPr>
-        <w:pStyle w:val="ListBullet"/>
-      </w:pPr>
-      <w:r>
-        <w:t>Pos (0 to 255) — wavetable frame position; morphs through the table</w:t>
-      </w:r>
-    </w:p>
-    <w:p>
-      <w:pPr>
-        <w:pStyle w:val="Heading2"/>
-      </w:pPr>
-      <w:r>
-        <w:t>X-Mod</w:t>
-      </w:r>
-    </w:p>
-    <w:p>
-      <w:r>
-        <w:t>X-Mod lets Oscillator 2 modulate Oscillator 1, in two lanes that run together:</w:t>
-      </w:r>
-    </w:p>
-    <w:p>
-      <w:pPr>
-        <w:pStyle w:val="ListBullet"/>
-      </w:pPr>
-      <w:r>
-        <w:t>Phase mode dropdown — FM (frequency modulation), PM (phase modulation, the default; stays in tune) or TZFM (through-zero FM). The Index knob (0 to 100) sets how much.</w:t>
-      </w:r>
-    </w:p>
-    <w:p>
-      <w:pPr>
-        <w:pStyle w:val="ListBullet"/>
-      </w:pPr>
-      <w:r>
-        <w:t>Amplitude mode dropdown — AM (amplitude modulation, the default), RM (ring modulation) or SSB (single-sideband frequency shift). The Depth knob (-100 to +100, with off at the centre) sets how much; with SSB, the Shift knob (up to plus or minus 2 kHz) slides every partial by a fixed number of hertz.</w:t>
-      </w:r>
-    </w:p>
-    <w:p>
-      <w:pPr>
-        <w:pStyle w:val="ListBullet"/>
-      </w:pPr>
-      <w:r>
-        <w:t>Sync — hard-syncs Oscillator 2 to Oscillator 1 for a formant-like edge.</w:t>
-      </w:r>
-    </w:p>
-    <w:p>
-      <w:pPr>
-        <w:pStyle w:val="ListBullet"/>
-      </w:pPr>
-      <w:r>
-        <w:t>Fdbk — feedback: Oscillator 1 also modulates Oscillator 2, for grittier tones.</w:t>
-      </w:r>
-    </w:p>
-    <w:p>
-      <w:pPr>
-        <w:pStyle w:val="Heading2"/>
-      </w:pPr>
-      <w:r>
-        <w:t>Mix</w:t>
-      </w:r>
-    </w:p>
-    <w:p>
-      <w:r>
-        <w:t>The Mix box sets the balance before the filter:</w:t>
-      </w:r>
-    </w:p>
-    <w:p>
-      <w:pPr>
-        <w:pStyle w:val="ListBullet"/>
-      </w:pPr>
-      <w:r>
-        <w:t>Noise type dropdown — White or Pink.</w:t>
-      </w:r>
-    </w:p>
-    <w:p>
-      <w:pPr>
-        <w:pStyle w:val="ListBullet"/>
-      </w:pPr>
-      <w:r>
-        <w:t>Osc 1 and Osc 2 — the level of each oscillator (-60 to +6 dB).</w:t>
-      </w:r>
-    </w:p>
-    <w:p>
-      <w:pPr>
-        <w:pStyle w:val="ListBullet"/>
-      </w:pPr>
-      <w:r>
-        <w:t>Noise — the noise level (-60 to 0 dB; the default of -60 dB is off).</w:t>
-      </w:r>
-    </w:p>
-    <w:p>
-      <w:pPr>
-        <w:pStyle w:val="Heading1"/>
-      </w:pPr>
-      <w:r>
-        <w:t>9. Pitch, Filter, Amp and Effects</w:t>
-      </w:r>
-    </w:p>
-    <w:p>
-      <w:r>
-        <w:t>The second row has four boxes. Each of the first three has an ADSR envelope. Envelope times run from 1 millisecond to 4 seconds. Every note the arpeggiator plays starts these envelopes, except a tied (legato) note, which carries on (see Gate, Legato and Glide). The knob labels are fixed words with no units; the Status Bar shows the value and its units as you hover or turn.</w:t>
-      </w:r>
-    </w:p>
-    <w:p>
-      <w:pPr>
-        <w:pStyle w:val="Heading2"/>
-      </w:pPr>
-      <w:r>
-        <w:t>Pitch</w:t>
-      </w:r>
-    </w:p>
-    <w:p>
-      <w:r>
-        <w:t>The pitch envelope adds a short blip or slide to the start of each note.</w:t>
-      </w:r>
-    </w:p>
-    <w:p>
-      <w:pPr>
-        <w:pStyle w:val="ListBullet"/>
-      </w:pPr>
-      <w:r>
-        <w:t>Target dropdown — which oscillators the envelope moves: Osc 1+2, or Osc 2 only (the default).</w:t>
-      </w:r>
-    </w:p>
-    <w:p>
-      <w:pPr>
-        <w:pStyle w:val="ListBullet"/>
-      </w:pPr>
-      <w:r>
-        <w:t>Depth (-24 to +24 semitones, default 0). At 0 the envelope does nothing.</w:t>
-      </w:r>
-    </w:p>
-    <w:p>
-      <w:pPr>
-        <w:pStyle w:val="ListBullet"/>
-      </w:pPr>
-      <w:r>
-        <w:t>A, D, S, R — attack, decay, sustain and release.</w:t>
-      </w:r>
-    </w:p>
-    <w:p>
-      <w:pPr>
-        <w:pStyle w:val="Heading2"/>
-      </w:pPr>
-      <w:r>
-        <w:t>Filter</w:t>
-      </w:r>
-    </w:p>
-    <w:p>
-      <w:pPr>
-        <w:pStyle w:val="ListBullet"/>
-      </w:pPr>
-      <w:r>
-        <w:t>Type dropdown — sixteen filters: LP 6 / 12 / 24, HP 6 / 12 / 24, BP 12 / 24, Notch, Notch 24, AP 12, Comb +, Comb -, Peak, Lo Shf and Hi Shf.</w:t>
-      </w:r>
-    </w:p>
-    <w:p>
-      <w:pPr>
-        <w:pStyle w:val="ListBullet"/>
-      </w:pPr>
-      <w:r>
-        <w:t>Drive (0 to 100 percent) — valve saturation before the filter.</w:t>
-      </w:r>
-    </w:p>
-    <w:p>
-      <w:pPr>
-        <w:pStyle w:val="ListBullet"/>
-      </w:pPr>
-      <w:r>
         <w:t>Cutoff (20 Hz to 18 kHz, default 3 kHz) and Reso (0 to 0.99, default 0.3).</w:t>
       </w:r>
     </w:p>
@@ -981,7 +959,6 @@
         <w:pStyle w:val="ListBullet"/>
       </w:pPr>
       <w:r>
-        <w:lastRenderedPageBreak/>
         <w:t>Low Cut (0 to 1000 Hz, off at 0) — a high-pass after the filter that clears sub-bass build-up.</w:t>
       </w:r>
     </w:p>
@@ -1039,10 +1016,10 @@
           <w:noProof/>
         </w:rPr>
         <w:drawing>
-          <wp:inline distT="0" distB="0" distL="0" distR="0" wp14:anchorId="46F50530" wp14:editId="36CFD013">
+          <wp:inline distT="0" distB="0" distL="0" distR="0" wp14:anchorId="62153509" wp14:editId="0DEFB6D7">
             <wp:extent cx="5274310" cy="686435"/>
             <wp:effectExtent l="0" t="0" r="2540" b="0"/>
-            <wp:docPr id="1935687872" name="Picture 5"/>
+            <wp:docPr id="832967435" name="Picture 5"/>
             <wp:cNvGraphicFramePr>
               <a:graphicFrameLocks xmlns:a="http://schemas.openxmlformats.org/drawingml/2006/main" noChangeAspect="1"/>
             </wp:cNvGraphicFramePr>
@@ -1050,7 +1027,7 @@
               <a:graphicData uri="http://schemas.openxmlformats.org/drawingml/2006/picture">
                 <pic:pic xmlns:pic="http://schemas.openxmlformats.org/drawingml/2006/picture">
                   <pic:nvPicPr>
-                    <pic:cNvPr id="1935687872" name=""/>
+                    <pic:cNvPr id="832967435" name=""/>
                     <pic:cNvPicPr/>
                   </pic:nvPicPr>
                   <pic:blipFill>
@@ -1155,6 +1132,7 @@
         <w:pStyle w:val="Heading2"/>
       </w:pPr>
       <w:r>
+        <w:lastRenderedPageBreak/>
         <w:t>Root, Octave, Inversion and Octaves</w:t>
       </w:r>
     </w:p>
@@ -1171,24 +1149,132 @@
         <w:pStyle w:val="ListBullet"/>
       </w:pPr>
       <w:r>
+        <w:t>Octave (0 to 8, default 4) — the octave the root sits in, which sets where the arpeggio starts.</w:t>
+      </w:r>
+    </w:p>
+    <w:p>
+      <w:pPr>
+        <w:pStyle w:val="ListBullet"/>
+      </w:pPr>
+      <w:r>
+        <w:t>Inversion (-4 to +4, default 0) — re-voices the chord. +1 moves the lowest note up an octave, +2 the lowest two, and so on. -1 moves the highest note down an octave, which gives wider, more open voicings. The setting is limited to what the chord has notes for.</w:t>
+      </w:r>
+    </w:p>
+    <w:p>
+      <w:pPr>
+        <w:pStyle w:val="ListBullet"/>
+      </w:pPr>
+      <w:r>
+        <w:t>Octaves (1 to 4, default 2) — how many octaves the chord tones are stacked over.</w:t>
+      </w:r>
+    </w:p>
+    <w:p>
+      <w:pPr>
+        <w:pStyle w:val="Heading2"/>
+      </w:pPr>
+      <w:r>
+        <w:t>Direction</w:t>
+      </w:r>
+    </w:p>
+    <w:p>
+      <w:r>
+        <w:t>Direction (-100 to +100, default +100) decides how the arpeggio travels through its notes. At +100 it climbs and starts again from the bottom, the classic up arpeggio. At -100 it falls. At 0 it climbs and falls equally, the up-and-down arpeggio. Values in between lean one way: +50 climbs through every note and comes down more quickly, skipping some notes. The pattern is exactly the same on every pass; nothing is random.</w:t>
+      </w:r>
+    </w:p>
+    <w:p>
+      <w:pPr>
+        <w:pStyle w:val="Heading2"/>
+      </w:pPr>
+      <w:r>
+        <w:t>Gate, Legato and Glide</w:t>
+      </w:r>
+    </w:p>
+    <w:p>
+      <w:pPr>
+        <w:pStyle w:val="ListBullet"/>
+      </w:pPr>
+      <w:r>
+        <w:t>Gate (1 to 100 percent of the step, default 50) — how long each note is held before it is released. Short values are staccato; 100 percent joins the notes.</w:t>
+      </w:r>
+    </w:p>
+    <w:p>
+      <w:pPr>
+        <w:pStyle w:val="ListBullet"/>
+      </w:pPr>
+      <w:r>
+        <w:t>Legato toggle — when on, a note with Gate at 100 percent is tied to the next one: the envelopes are not restarted across the join.</w:t>
+      </w:r>
+    </w:p>
+    <w:p>
+      <w:pPr>
+        <w:pStyle w:val="ListBullet"/>
+      </w:pPr>
+      <w:r>
+        <w:t>Glide (0 to 500 milliseconds, default 0) — how long the pitch takes to slide from one note to the next. You hear glide only on tied notes.</w:t>
+      </w:r>
+    </w:p>
+    <w:p>
+      <w:r>
+        <w:t>So the three work together:</w:t>
+      </w:r>
+    </w:p>
+    <w:p>
+      <w:pPr>
+        <w:pStyle w:val="ListBullet"/>
+      </w:pPr>
+      <w:r>
+        <w:t>Legato on and Gate at 100 percent — tied notes that slide over the Glide time, like a 303 slide.</w:t>
+      </w:r>
+    </w:p>
+    <w:p>
+      <w:pPr>
+        <w:pStyle w:val="ListBullet"/>
+      </w:pPr>
+      <w:r>
+        <w:t>Legato on and Gate below 100 percent — separate plucked notes with gaps; no glide.</w:t>
+      </w:r>
+    </w:p>
+    <w:p>
+      <w:pPr>
+        <w:pStyle w:val="ListBullet"/>
+      </w:pPr>
+      <w:r>
+        <w:t>Legato off — every note is plucked; no glide, whatever Glide is set to.</w:t>
+      </w:r>
+    </w:p>
+    <w:p>
+      <w:r>
+        <w:t>To slide only on some steps, modulate Gate up to 100 percent on those steps with a stepped modulator.</w:t>
+      </w:r>
+    </w:p>
+    <w:p>
+      <w:pPr>
+        <w:pStyle w:val="Heading2"/>
+      </w:pPr>
+      <w:r>
+        <w:t>Snap</w:t>
+      </w:r>
+    </w:p>
+    <w:p>
+      <w:r>
+        <w:t>With Snap on, every chord tone is moved to the nearest note of the chosen scale, so the arpeggio is always strictly in key. With Snap off (the default) the chord is played as named. In sparse scales, Snap can make two chord tones land on the same note.</w:t>
+      </w:r>
+    </w:p>
+    <w:p>
+      <w:pPr>
+        <w:pStyle w:val="Heading2"/>
+      </w:pPr>
+      <w:r>
+        <w:t>Step Pattern and Accent</w:t>
+      </w:r>
+    </w:p>
+    <w:p>
+      <w:r>
+        <w:t xml:space="preserve">The row of cells at the right of the Appergater is the step pattern. Steps (1 to 16, default 4) sets how many cells it has. Each step is in one of three states: Off, On or Accented. Click a cell to cycle it from Off to On to Accented and back to Off; Shift+click goes the other way, and you can drag across cells to paint them. An Off step is a rest, so the arpeggio is silent on that step. An On step plays normally. An Accented step plays up to </w:t>
+      </w:r>
+      <w:r>
         <w:lastRenderedPageBreak/>
-        <w:t>Octave (0 to 8, default 4) — the octave the root sits in, which sets where the arpeggio starts.</w:t>
-      </w:r>
-    </w:p>
-    <w:p>
-      <w:pPr>
-        <w:pStyle w:val="ListBullet"/>
-      </w:pPr>
-      <w:r>
-        <w:t>Inversion (-4 to +4, default 0) — re-voices the chord. +1 moves the lowest note up an octave, +2 the lowest two, and so on. -1 moves the highest note down an octave, which gives wider, more open voicings. The setting is limited to what the chord has notes for.</w:t>
-      </w:r>
-    </w:p>
-    <w:p>
-      <w:pPr>
-        <w:pStyle w:val="ListBullet"/>
-      </w:pPr>
-      <w:r>
-        <w:t>Octaves (1 to 4, default 2) — how many octaves the chord tones are stacked over.</w:t>
+        <w:t>6 dB louder, with the filter up to an octave brighter, scaled by the Accent knob (0 to 100 percent, default 0). Presets made before the Off state existed play exactly as they did, with every step On. A moving line shows which step the arpeggio is on. In Loop mode the pattern follows the beat, so accents stay locked to the bar; in MIDI mode it counts from each key press.</w:t>
       </w:r>
     </w:p>
     <w:p>
@@ -1196,112 +1282,6 @@
         <w:pStyle w:val="Heading2"/>
       </w:pPr>
       <w:r>
-        <w:t>Direction</w:t>
-      </w:r>
-    </w:p>
-    <w:p>
-      <w:r>
-        <w:t>Direction (-100 to +100, default +100) decides how the arpeggio travels through its notes. At +100 it climbs and starts again from the bottom, the classic up arpeggio. At -100 it falls. At 0 it climbs and falls equally, the up-and-down arpeggio. Values in between lean one way: +50 climbs through every note and comes down more quickly, skipping some notes. The pattern is exactly the same on every pass; nothing is random.</w:t>
-      </w:r>
-    </w:p>
-    <w:p>
-      <w:pPr>
-        <w:pStyle w:val="Heading2"/>
-      </w:pPr>
-      <w:r>
-        <w:t>Gate, Legato and Glide</w:t>
-      </w:r>
-    </w:p>
-    <w:p>
-      <w:pPr>
-        <w:pStyle w:val="ListBullet"/>
-      </w:pPr>
-      <w:r>
-        <w:t>Gate (1 to 100 percent of the step, default 50) — how long each note is held before it is released. Short values are staccato; 100 percent joins the notes.</w:t>
-      </w:r>
-    </w:p>
-    <w:p>
-      <w:pPr>
-        <w:pStyle w:val="ListBullet"/>
-      </w:pPr>
-      <w:r>
-        <w:t>Legato toggle — when on, a note with Gate at 100 percent is tied to the next one: the envelopes are not restarted across the join.</w:t>
-      </w:r>
-    </w:p>
-    <w:p>
-      <w:pPr>
-        <w:pStyle w:val="ListBullet"/>
-      </w:pPr>
-      <w:r>
-        <w:t>Glide (0 to 500 milliseconds, default 0) — how long the pitch takes to slide from one note to the next. You hear glide only on tied notes.</w:t>
-      </w:r>
-    </w:p>
-    <w:p>
-      <w:r>
-        <w:t>So the three work together:</w:t>
-      </w:r>
-    </w:p>
-    <w:p>
-      <w:pPr>
-        <w:pStyle w:val="ListBullet"/>
-      </w:pPr>
-      <w:r>
-        <w:t>Legato on and Gate at 100 percent — tied notes that slide over the Glide time, like a 303 slide.</w:t>
-      </w:r>
-    </w:p>
-    <w:p>
-      <w:pPr>
-        <w:pStyle w:val="ListBullet"/>
-      </w:pPr>
-      <w:r>
-        <w:t>Legato on and Gate below 100 percent — separate plucked notes with gaps; no glide.</w:t>
-      </w:r>
-    </w:p>
-    <w:p>
-      <w:pPr>
-        <w:pStyle w:val="ListBullet"/>
-      </w:pPr>
-      <w:r>
-        <w:t>Legato off — every note is plucked; no glide, whatever Glide is set to.</w:t>
-      </w:r>
-    </w:p>
-    <w:p>
-      <w:r>
-        <w:t>To slide only on some steps, modulate Gate up to 100 percent on those steps with a stepped modulator.</w:t>
-      </w:r>
-    </w:p>
-    <w:p>
-      <w:pPr>
-        <w:pStyle w:val="Heading2"/>
-      </w:pPr>
-      <w:r>
-        <w:t>Snap</w:t>
-      </w:r>
-    </w:p>
-    <w:p>
-      <w:r>
-        <w:t>With Snap on, every chord tone is moved to the nearest note of the chosen scale, so the arpeggio is always strictly in key. With Snap off (the default) the chord is played as named. In sparse scales, Snap can make two chord tones land on the same note.</w:t>
-      </w:r>
-    </w:p>
-    <w:p>
-      <w:pPr>
-        <w:pStyle w:val="Heading2"/>
-      </w:pPr>
-      <w:r>
-        <w:t>Accent</w:t>
-      </w:r>
-    </w:p>
-    <w:p>
-      <w:r>
-        <w:t>The row of cells at the right of the Appergater is the accent pattern. Acc Steps (1 to 16, default 4) sets how many cells it has, and you click a cell to switch that step's accent on or off. An accented step plays up to 6 dB louder, with the filter up to an octave brighter, scaled by the Accent knob (0 to 100 percent, default 0). A moving line shows which step the arpeggio is on. In Loop mode the pattern follows the beat, so accents stay locked to the bar; in MIDI mode it counts from each key press.</w:t>
-      </w:r>
-    </w:p>
-    <w:p>
-      <w:pPr>
-        <w:pStyle w:val="Heading2"/>
-      </w:pPr>
-      <w:r>
-        <w:lastRenderedPageBreak/>
         <w:t>Playing with a Keyboard</w:t>
       </w:r>
     </w:p>
@@ -1361,10 +1341,10 @@
           <w:noProof/>
         </w:rPr>
         <w:drawing>
-          <wp:inline distT="0" distB="0" distL="0" distR="0" wp14:anchorId="763FE2AB" wp14:editId="61AECDF4">
+          <wp:inline distT="0" distB="0" distL="0" distR="0" wp14:anchorId="4487CAE1" wp14:editId="6A085870">
             <wp:extent cx="5274310" cy="701040"/>
             <wp:effectExtent l="0" t="0" r="2540" b="3810"/>
-            <wp:docPr id="983407059" name="Picture 6"/>
+            <wp:docPr id="1286523729" name="Picture 6"/>
             <wp:cNvGraphicFramePr>
               <a:graphicFrameLocks xmlns:a="http://schemas.openxmlformats.org/drawingml/2006/main" noChangeAspect="1"/>
             </wp:cNvGraphicFramePr>
@@ -1372,7 +1352,7 @@
               <a:graphicData uri="http://schemas.openxmlformats.org/drawingml/2006/picture">
                 <pic:pic xmlns:pic="http://schemas.openxmlformats.org/drawingml/2006/picture">
                   <pic:nvPicPr>
-                    <pic:cNvPr id="983407059" name=""/>
+                    <pic:cNvPr id="1286523729" name=""/>
                     <pic:cNvPicPr/>
                   </pic:nvPicPr>
                   <pic:blipFill>
@@ -1408,7 +1388,7 @@
         <w:rPr>
           <w:i/>
         </w:rPr>
-        <w:t>The Appergater: scale, chord, rate and trigger, the knob row and the accent pattern.</w:t>
+        <w:t>The Appergater: scale, chord, rate and trigger, the knob row and the step pattern.</w:t>
       </w:r>
     </w:p>
     <w:p>
@@ -1431,11 +1411,8 @@
     </w:p>
     <w:p>
       <w:r>
-        <w:t xml:space="preserve">Add destinations with the + Target button; the assignments are shown one at a time, so step through them with the up and down arrows and the counter at the right. Each assignment has a bipolar depth (-100 to +100 percent) and a source-side curve. A modulator can move the arpeggio controls listed in the Appergater chapter, Osc 2 Semi, the oscillator positions and levels, the noise level, X-Mod Index, Depth and SSB shift, the </w:t>
-      </w:r>
-      <w:r>
         <w:lastRenderedPageBreak/>
-        <w:t>filter's Cutoff, Resonance, Drive and Env Depth, the Amp Level and the Pitch Env depth. When a knob is a destination, an arc around it shows the live modulated value.</w:t>
+        <w:t>Add destinations with the + Target button; the assignments are shown one at a time, so step through them with the up and down arrows and the counter at the right. Each assignment has a bipolar depth (-100 to +100 percent) and a source-side curve. A modulator can move the arpeggio controls listed in the Appergater chapter, Osc 2 Semi, the oscillator positions and levels, the noise level, X-Mod Index, Depth and SSB shift, the filter's Cutoff, Resonance, Drive and Env Depth, the Amp Level and the Pitch Env depth. When a knob is a destination, an arc around it shows the live modulated value.</w:t>
       </w:r>
     </w:p>
     <w:p>
@@ -1452,10 +1429,10 @@
           <w:noProof/>
         </w:rPr>
         <w:drawing>
-          <wp:inline distT="0" distB="0" distL="0" distR="0" wp14:anchorId="2EA40BD0" wp14:editId="086D3C4B">
+          <wp:inline distT="0" distB="0" distL="0" distR="0" wp14:anchorId="046791BE" wp14:editId="06B1B20D">
             <wp:extent cx="5274310" cy="1386840"/>
             <wp:effectExtent l="0" t="0" r="2540" b="3810"/>
-            <wp:docPr id="776175982" name="Picture 7"/>
+            <wp:docPr id="1326995810" name="Picture 7"/>
             <wp:cNvGraphicFramePr>
               <a:graphicFrameLocks xmlns:a="http://schemas.openxmlformats.org/drawingml/2006/main" noChangeAspect="1"/>
             </wp:cNvGraphicFramePr>
@@ -1463,7 +1440,7 @@
               <a:graphicData uri="http://schemas.openxmlformats.org/drawingml/2006/picture">
                 <pic:pic xmlns:pic="http://schemas.openxmlformats.org/drawingml/2006/picture">
                   <pic:nvPicPr>
-                    <pic:cNvPr id="776175982" name=""/>
+                    <pic:cNvPr id="1326995810" name=""/>
                     <pic:cNvPicPr/>
                   </pic:nvPicPr>
                   <pic:blipFill>
@@ -1554,6 +1531,7 @@
         <w:pStyle w:val="ListBullet"/>
       </w:pPr>
       <w:r>
+        <w:lastRenderedPageBreak/>
         <w:t>Reverb — Room, Hall, Plate or Spring, with Size, Pre-delay, Diffusion, Damp, Mod and Dirt. Reverb is a pure send.</w:t>
       </w:r>
     </w:p>
@@ -1565,12 +1543,11 @@
         <w:rPr>
           <w:noProof/>
         </w:rPr>
-        <w:lastRenderedPageBreak/>
         <w:drawing>
-          <wp:inline distT="0" distB="0" distL="0" distR="0" wp14:anchorId="3D06FABD" wp14:editId="42D88B85">
+          <wp:inline distT="0" distB="0" distL="0" distR="0" wp14:anchorId="70D6BB70" wp14:editId="1DDEC82A">
             <wp:extent cx="5274310" cy="3340100"/>
             <wp:effectExtent l="0" t="0" r="2540" b="0"/>
-            <wp:docPr id="2096442457" name="Picture 8"/>
+            <wp:docPr id="95850960" name="Picture 8"/>
             <wp:cNvGraphicFramePr>
               <a:graphicFrameLocks xmlns:a="http://schemas.openxmlformats.org/drawingml/2006/main" noChangeAspect="1"/>
             </wp:cNvGraphicFramePr>
@@ -1578,7 +1555,7 @@
               <a:graphicData uri="http://schemas.openxmlformats.org/drawingml/2006/picture">
                 <pic:pic xmlns:pic="http://schemas.openxmlformats.org/drawingml/2006/picture">
                   <pic:nvPicPr>
-                    <pic:cNvPr id="2096442457" name=""/>
+                    <pic:cNvPr id="95850960" name=""/>
                     <pic:cNvPicPr/>
                   </pic:nvPicPr>
                   <pic:blipFill>
@@ -1658,6 +1635,312 @@
     </w:p>
     <w:p>
       <w:pPr>
+        <w:pStyle w:val="Heading2"/>
+      </w:pPr>
+      <w:r>
+        <w:t>Clips</w:t>
+      </w:r>
+    </w:p>
+    <w:p>
+      <w:r>
+        <w:t xml:space="preserve">A clip is a stored copy of one layer's current state, ready to recall in a moment while the music plays. Every layer has up to eight clips. They sit in the Clip strip in the layer's header, between the layer-preset dropdown and the Save button: the word Clip followed </w:t>
+      </w:r>
+      <w:r>
+        <w:lastRenderedPageBreak/>
+        <w:t>by pads numbered 1 to 8. Use clips to prepare variations of a layer and switch between them in time.</w:t>
+      </w:r>
+    </w:p>
+    <w:p>
+      <w:r>
+        <w:t>Each pad is lit in the layer's own colour:</w:t>
+      </w:r>
+    </w:p>
+    <w:p>
+      <w:pPr>
+        <w:pStyle w:val="ListBullet"/>
+      </w:pPr>
+      <w:r>
+        <w:t>Bright and steady — the clip that is playing.</w:t>
+      </w:r>
+    </w:p>
+    <w:p>
+      <w:pPr>
+        <w:pStyle w:val="ListBullet"/>
+      </w:pPr>
+      <w:r>
+        <w:t>Dim — a clip is stored here and is available.</w:t>
+      </w:r>
+    </w:p>
+    <w:p>
+      <w:pPr>
+        <w:pStyle w:val="ListBullet"/>
+      </w:pPr>
+      <w:r>
+        <w:t>Unlit, with just its number — the pad is empty.</w:t>
+      </w:r>
+    </w:p>
+    <w:p>
+      <w:pPr>
+        <w:pStyle w:val="ListBullet"/>
+      </w:pPr>
+      <w:r>
+        <w:t>Pulsing — the clip is queued and will start at the next bar.</w:t>
+      </w:r>
+    </w:p>
+    <w:p>
+      <w:pPr>
+        <w:pStyle w:val="ListBullet"/>
+      </w:pPr>
+      <w:r>
+        <w:t>Flashing on and off — the playing clip belongs to a muted layer.</w:t>
+      </w:r>
+    </w:p>
+    <w:p>
+      <w:r>
+        <w:t>How to use the pads:</w:t>
+      </w:r>
+    </w:p>
+    <w:p>
+      <w:pPr>
+        <w:pStyle w:val="ListBullet"/>
+      </w:pPr>
+      <w:r>
+        <w:t>Click a stored pad to launch it. If playback is running, the clip waits for the next bar and the pad pulses until it starts; when playback is stopped it starts at once. Clicking another stored pad while one is waiting replaces the waiting clip.</w:t>
+      </w:r>
+    </w:p>
+    <w:p>
+      <w:pPr>
+        <w:pStyle w:val="ListBullet"/>
+      </w:pPr>
+      <w:r>
+        <w:t>Click the playing pad to mute the layer. Click it again to unmute. If another clip is waiting, the click cancels the wait instead and the playing clip carries on.</w:t>
+      </w:r>
+    </w:p>
+    <w:p>
+      <w:pPr>
+        <w:pStyle w:val="ListBullet"/>
+      </w:pPr>
+      <w:r>
+        <w:t>Click an empty pad to store the layer's current state there. Nothing is lost, so there is no question. The new clip becomes the playing one.</w:t>
+      </w:r>
+    </w:p>
+    <w:p>
+      <w:pPr>
+        <w:pStyle w:val="ListBullet"/>
+      </w:pPr>
+      <w:r>
+        <w:t>Shift + click any pad to store the layer's current state in it. If the pad holds a different clip from the one playing, mu-Toni asks you to confirm with Replace. Storing over the playing clip, to update it after a tweak, needs no confirmation.</w:t>
+      </w:r>
+    </w:p>
+    <w:p>
+      <w:pPr>
+        <w:pStyle w:val="ListBullet"/>
+      </w:pPr>
+      <w:r>
+        <w:t>Right-click a pad (or Ctrl + click) to open a small menu with Store here and Clear. Clear is available only on a stored pad and asks you to confirm. Clearing the playing clip leaves the layer playing as it is; no pad is lit afterwards.</w:t>
+      </w:r>
+    </w:p>
+    <w:p>
+      <w:r>
+        <w:t>Turning a knob changes only the layer that is playing, not the stored clip. To keep a tweak, store it again with Shift + click. Recalling a clip replaces any changes you have not stored, without asking.</w:t>
+      </w:r>
+    </w:p>
+    <w:p>
+      <w:r>
+        <w:t>Resetting a layer with Reset also clears its clips; the confirmation then reads This also clears its clips. Deleting a layer removes its clips with it. Clips are saved with full presets (.muToni) and with your DAW session or standalone state. Clips are not saved in single-layer .muArp files.</w:t>
+      </w:r>
+    </w:p>
+    <w:p>
+      <w:r>
+        <w:t>In Performance mode the Clip strip cannot be clicked, but it keeps moving so you can see what the control surface is doing.</w:t>
+      </w:r>
+    </w:p>
+    <w:p>
+      <w:r>
+        <w:rPr>
+          <w:i/>
+        </w:rPr>
+        <w:t>[Screenshot: Layer header with the Clip strip: eight numbered pads showing playing, stored, empty and queued states.]</w:t>
+      </w:r>
+    </w:p>
+    <w:p>
+      <w:pPr>
+        <w:pStyle w:val="Heading2"/>
+      </w:pPr>
+      <w:r>
+        <w:t>Performance Mode (Standalone)</w:t>
+      </w:r>
+    </w:p>
+    <w:p>
+      <w:r>
+        <w:t>Performance mode turns the standalone app into a locked gig view. The screen shows the preset that is playing, exactly as normal, but you cannot change anything with the mouse or keyboard. Only a connected control surface (set up through MIDI mapping) switches presets and layers. Performance mode is not available in the VST3 or CLAP plug-in.</w:t>
+      </w:r>
+    </w:p>
+    <w:p>
+      <w:r>
+        <w:lastRenderedPageBreak/>
+        <w:t>Performance mode plays a performance: a saved list of up to eight full presets, stored as a .muPerformance file in the Performances folder inside your content folder. You make, edit and choose performances in the Performance chooser.</w:t>
+      </w:r>
+    </w:p>
+    <w:p>
+      <w:pPr>
+        <w:pStyle w:val="Heading3"/>
+      </w:pPr>
+      <w:r>
+        <w:t>The Performance Chooser</w:t>
+      </w:r>
+    </w:p>
+    <w:p>
+      <w:r>
+        <w:t>Open the chooser from the Performances entry at the bottom of the preset dropdown in the Transport Bar, from the Performances button in the footer of the Preset Browser, or by clicking the Perf button (or pressing Ctrl+P) when no performance has been chosen yet. You can only open it while Performance mode is off.</w:t>
+      </w:r>
+    </w:p>
+    <w:p>
+      <w:pPr>
+        <w:pStyle w:val="ListBullet"/>
+      </w:pPr>
+      <w:r>
+        <w:t>On the left is the list of your saved performances. Click one to open it. The list scrolls.</w:t>
+      </w:r>
+    </w:p>
+    <w:p>
+      <w:pPr>
+        <w:pStyle w:val="ListBullet"/>
+      </w:pPr>
+      <w:r>
+        <w:t>On the right are the eight places in the performance. Each row shows its number, the preset name, which product the preset is for, and buttons. An empty row has a + Preset button. A filled row has Replace, Up, Down and Remove: Replace picks a different preset, Up and Down move the preset in the order, and Remove empties the place.</w:t>
+      </w:r>
+    </w:p>
+    <w:p>
+      <w:pPr>
+        <w:pStyle w:val="ListBullet"/>
+      </w:pPr>
+      <w:r>
+        <w:t>A preset whose file can no longer be found stays in its place with a red lamp and the word missing. Replace it or remove it.</w:t>
+      </w:r>
+    </w:p>
+    <w:p>
+      <w:pPr>
+        <w:pStyle w:val="ListBullet"/>
+      </w:pPr>
+      <w:r>
+        <w:t>New starts an empty performance. Save stores the performance under a name and an optional description. Rename changes its name. Delete removes the saved file after asking you to confirm. Saving under the name of another performance asks before it overwrites.</w:t>
+      </w:r>
+    </w:p>
+    <w:p>
+      <w:pPr>
+        <w:pStyle w:val="ListBullet"/>
+      </w:pPr>
+      <w:r>
+        <w:t>Use makes this performance the one that Performance mode plays, then closes the chooser. It does not change the preset that is playing now. If the performance is new or has changes you have not saved, Use saves it first (a new one asks for a name). Use is unavailable while the performance has no presets.</w:t>
+      </w:r>
+    </w:p>
+    <w:p>
+      <w:pPr>
+        <w:pStyle w:val="ListBullet"/>
+      </w:pPr>
+      <w:r>
+        <w:t>While you have unsaved changes the title shows the name followed by (unsaved). Closing the chooser, clicking New, or opening another saved performance then asks Discard unsaved changes? Choose Discard to lose the changes, or cancel to keep working.</w:t>
+      </w:r>
+    </w:p>
+    <w:p>
+      <w:r>
+        <w:t>To fill a place, click + Preset or Replace. The Preset Browser opens in pick mode: its Load button reads Pick, and the Performances button is hidden. Select a preset and click Pick (or double-click it) to put it in the place and return to the chooser with your other edits kept. Close returns to the chooser without picking. The browser lists presets for this product only.</w:t>
+      </w:r>
+    </w:p>
+    <w:p>
+      <w:r>
+        <w:rPr>
+          <w:i/>
+        </w:rPr>
+        <w:t>[Screenshot: Performance chooser: saved performances on the left, the eight place rows on the right, and the New, Save, Rename, Delete and Use buttons.]</w:t>
+      </w:r>
+    </w:p>
+    <w:p>
+      <w:pPr>
+        <w:pStyle w:val="Heading3"/>
+      </w:pPr>
+      <w:r>
+        <w:t>Entering</w:t>
+      </w:r>
+    </w:p>
+    <w:p>
+      <w:r>
+        <w:t>Click the Perf button (or press Ctrl+P). The preset that is playing carries on. Any open window, such as the Preset Browser, Mixer or Settings, closes without saving. If no performance has been chosen yet, the Performance chooser opens instead and the mode stays off.</w:t>
+      </w:r>
+    </w:p>
+    <w:p>
+      <w:pPr>
+        <w:pStyle w:val="Heading3"/>
+      </w:pPr>
+      <w:r>
+        <w:lastRenderedPageBreak/>
+        <w:t>What You See</w:t>
+      </w:r>
+    </w:p>
+    <w:p>
+      <w:pPr>
+        <w:pStyle w:val="ListBullet"/>
+      </w:pPr>
+      <w:r>
+        <w:t>The Perf button lights in the app colour, and a thin lit line runs along the bottom of the Transport Bar.</w:t>
+      </w:r>
+    </w:p>
+    <w:p>
+      <w:pPr>
+        <w:pStyle w:val="ListBullet"/>
+      </w:pPr>
+      <w:r>
+        <w:t>The preset dropdown, New and Save are replaced by a step indicator: a display showing the position and name of the playing preset (for example 3/8 Bassline), followed by a dimmed next preset when there is room, and a row of eight lamps. A bright lamp is the playing preset, a dim lamp is an available preset, a pulsing lamp is the preset queued to start, and an unlit lamp is an empty place. A red lamp marks a preset whose file is missing.</w:t>
+      </w:r>
+    </w:p>
+    <w:p>
+      <w:pPr>
+        <w:pStyle w:val="ListBullet"/>
+      </w:pPr>
+      <w:r>
+        <w:t>When the control surface queues a switch, the playing preset stays on screen until the switch lands. The queued lamp pulses, an orange SWP badge appears, the display shows the queued preset in pulsing text, and the status bar reads Queued followed by the preset. All of this clears when the switch happens or is cancelled. The switch lands at the next bar.</w:t>
+      </w:r>
+    </w:p>
+    <w:p>
+      <w:pPr>
+        <w:pStyle w:val="ListBullet"/>
+      </w:pPr>
+      <w:r>
+        <w:t>In the sidebar, the Add button is replaced by a read-only indicator such as Layer 3/5. The screen follows the control surface: selecting a layer on the surface shows that layer on screen.</w:t>
+      </w:r>
+    </w:p>
+    <w:p>
+      <w:pPr>
+        <w:pStyle w:val="ListBullet"/>
+      </w:pPr>
+      <w:r>
+        <w:t>Nothing dims or changes colour; knobs, meters and the playhead keep moving, so you can see what the surface is doing.</w:t>
+      </w:r>
+    </w:p>
+    <w:p>
+      <w:pPr>
+        <w:pStyle w:val="Heading3"/>
+      </w:pPr>
+      <w:r>
+        <w:t>Leaving</w:t>
+      </w:r>
+    </w:p>
+    <w:p>
+      <w:r>
+        <w:t>Press and hold the Perf button for one second. The button fills from left to right while you hold, and the status bar reads Hold to leave Performance mode. Let go early to stay in the mode. A plain click does nothing, so you cannot leave by accident. When you leave, the normal controls come back.</w:t>
+      </w:r>
+    </w:p>
+    <w:p>
+      <w:r>
+        <w:rPr>
+          <w:i/>
+        </w:rPr>
+        <w:t>[Screenshot: Transport Bar in Performance mode: lit Perf button, step indicator with eight lamps, and the lit line along the bottom edge.]</w:t>
+      </w:r>
+    </w:p>
+    <w:p>
+      <w:pPr>
         <w:pStyle w:val="Heading1"/>
       </w:pPr>
       <w:r>
@@ -1687,36 +1970,36 @@
         <w:pStyle w:val="ListBullet"/>
       </w:pPr>
       <w:r>
+        <w:t>Display, Size — Medium or Large window. Reopen the app for the label fonts to rescale fully.</w:t>
+      </w:r>
+    </w:p>
+    <w:p>
+      <w:pPr>
+        <w:pStyle w:val="ListBullet"/>
+      </w:pPr>
+      <w:r>
+        <w:t>Transport, Tempo — internal clock, 20.0 to 300.0 BPM with one decimal, also editable from the transport BPM field</w:t>
+      </w:r>
+    </w:p>
+    <w:p>
+      <w:pPr>
+        <w:pStyle w:val="ListBullet"/>
+      </w:pPr>
+      <w:r>
+        <w:t>Transport, Time signature (standalone) — 2/4, 3/4, 4/4, 5/4, 6/4, 7/4, 5/8, 6/8, 7/8, 9/8 or 12/8; default 4/4. It changes how the bar.beat.sixteenth Position readout counts (a beat is a quarter note in x/4 and an eighth note in x/8). The arpeggiator steps are not affected.</w:t>
+      </w:r>
+    </w:p>
+    <w:p>
+      <w:r>
+        <w:t>MIDI (right column):</w:t>
+      </w:r>
+    </w:p>
+    <w:p>
+      <w:pPr>
+        <w:pStyle w:val="ListBullet"/>
+      </w:pPr>
+      <w:r>
         <w:lastRenderedPageBreak/>
-        <w:t>Display, Size — Medium or Large window. Reopen the app for the label fonts to rescale fully.</w:t>
-      </w:r>
-    </w:p>
-    <w:p>
-      <w:pPr>
-        <w:pStyle w:val="ListBullet"/>
-      </w:pPr>
-      <w:r>
-        <w:t>Transport, Tempo — internal clock, 20.0 to 300.0 BPM with one decimal, also editable from the transport BPM field</w:t>
-      </w:r>
-    </w:p>
-    <w:p>
-      <w:pPr>
-        <w:pStyle w:val="ListBullet"/>
-      </w:pPr>
-      <w:r>
-        <w:t>Transport, Time signature (standalone) — 2/4, 3/4, 4/4, 5/4, 6/4, 7/4, 5/8, 6/8, 7/8, 9/8 or 12/8; default 4/4. It changes how the bar.beat.sixteenth Position readout counts (a beat is a quarter note in x/4 and an eighth note in x/8). The arpeggiator steps are not affected.</w:t>
-      </w:r>
-    </w:p>
-    <w:p>
-      <w:r>
-        <w:t>MIDI (right column):</w:t>
-      </w:r>
-    </w:p>
-    <w:p>
-      <w:pPr>
-        <w:pStyle w:val="ListBullet"/>
-      </w:pPr>
-      <w:r>
         <w:t>MIDI In, Notes In — Omni or channel 1 to 16: which notes drive the arpeggios (see Playing with a Keyboard).</w:t>
       </w:r>
     </w:p>
@@ -1738,7 +2021,7 @@
     </w:p>
     <w:p>
       <w:r>
-        <w:t>Tony's line, Its an appagator, is it a powerful tool?, and a Contact Support link sit at the bottom of the page.</w:t>
+        <w:t>Tony's often asked question, Has it got an appagator, is it a powerful tool?, and a Contact Support link sit at the bottom of the page.</w:t>
       </w:r>
     </w:p>
     <w:p>
@@ -1750,10 +2033,10 @@
           <w:noProof/>
         </w:rPr>
         <w:drawing>
-          <wp:inline distT="0" distB="0" distL="0" distR="0" wp14:anchorId="1381AB16" wp14:editId="105C5FEC">
+          <wp:inline distT="0" distB="0" distL="0" distR="0" wp14:anchorId="65A7E261" wp14:editId="30509131">
             <wp:extent cx="5274310" cy="3340100"/>
             <wp:effectExtent l="0" t="0" r="2540" b="0"/>
-            <wp:docPr id="1361486462" name="Picture 9"/>
+            <wp:docPr id="1067231348" name="Picture 9"/>
             <wp:cNvGraphicFramePr>
               <a:graphicFrameLocks xmlns:a="http://schemas.openxmlformats.org/drawingml/2006/main" noChangeAspect="1"/>
             </wp:cNvGraphicFramePr>
@@ -1761,7 +2044,7 @@
               <a:graphicData uri="http://schemas.openxmlformats.org/drawingml/2006/picture">
                 <pic:pic xmlns:pic="http://schemas.openxmlformats.org/drawingml/2006/picture">
                   <pic:nvPicPr>
-                    <pic:cNvPr id="1361486462" name=""/>
+                    <pic:cNvPr id="1067231348" name=""/>
                     <pic:cNvPicPr/>
                   </pic:nvPicPr>
                   <pic:blipFill>
@@ -1818,7 +2101,6 @@
         <w:pStyle w:val="ListBullet"/>
       </w:pPr>
       <w:r>
-        <w:lastRenderedPageBreak/>
         <w:t>Clock only  —  you start and stop mu-Toni with its own Play button, but the tempo and beat follow the clock's ticks. The BPM field is locked and shows the clock's tempo. The clock's Start and Stop messages are ignored.</w:t>
       </w:r>
     </w:p>
@@ -1900,11 +2182,7 @@
     </w:p>
     <w:p>
       <w:r>
-        <w:t>mu-Toni can load presets from incoming MIDI program-change messages. On channels 1 to 8 a program change loads the matching .muArp into that layer; on channel 9 it loads a full .muToni preset. While playing, the change is staged and applied seamlessly (hot-</w:t>
-      </w:r>
-      <w:r>
-        <w:lastRenderedPageBreak/>
-        <w:t>swap). Configure the mappings with the Layer Presets and Full Presets buttons in Settings, under MIDI Program Change.</w:t>
+        <w:t>mu-Toni can load presets from incoming MIDI program-change messages. On channels 1 to 8 a program change loads the matching .muArp into that layer; on channel 9 it loads a full .muToni preset. While playing, the change is staged and applied seamlessly (hot-swap). Configure the mappings with the Layer Presets and Full Presets buttons in Settings, under MIDI Program Change.</w:t>
       </w:r>
     </w:p>
     <w:p>
@@ -2010,7 +2288,7 @@
         <w:pStyle w:val="ListBullet"/>
       </w:pPr>
       <w:r>
-        <w:t>Pulse and accent: set Acc Steps to 4, switch on the first and third cells and raise Accent to 60 percent for a driving accent pattern.</w:t>
+        <w:t>Pulse and accent: set Steps to 4, set the first and third cells to Accented and raise Accent to 60 percent for a driving accent pattern.</w:t>
       </w:r>
     </w:p>
     <w:p>
@@ -2034,7 +2312,6 @@
         <w:pStyle w:val="ListBullet"/>
       </w:pPr>
       <w:r>
-        <w:lastRenderedPageBreak/>
         <w:t>Evolving patterns: put a slow smooth modulator on Direction or on the filter Cutoff.</w:t>
       </w:r>
     </w:p>
@@ -2147,7 +2424,7 @@
   <w:abstractNum w:abstractNumId="0" w15:restartNumberingAfterBreak="0">
     <w:nsid w:val="FFFFFF89"/>
     <w:multiLevelType w:val="singleLevel"/>
-    <w:tmpl w:val="52A4CECA"/>
+    <w:tmpl w:val="8AD6CBEE"/>
     <w:lvl w:ilvl="0">
       <w:start w:val="1"/>
       <w:numFmt w:val="bullet"/>
@@ -2165,7 +2442,7 @@
       </w:rPr>
     </w:lvl>
   </w:abstractNum>
-  <w:num w:numId="1" w16cid:durableId="934366167">
+  <w:num w:numId="1" w16cid:durableId="804006899">
     <w:abstractNumId w:val="0"/>
   </w:num>
 </w:numbering>
@@ -2579,7 +2856,7 @@
     <w:link w:val="Heading1Char"/>
     <w:uiPriority w:val="9"/>
     <w:qFormat/>
-    <w:rsid w:val="0069648A"/>
+    <w:rsid w:val="007B4806"/>
     <w:pPr>
       <w:keepNext/>
       <w:keepLines/>
@@ -2601,7 +2878,7 @@
     <w:uiPriority w:val="9"/>
     <w:unhideWhenUsed/>
     <w:qFormat/>
-    <w:rsid w:val="0069648A"/>
+    <w:rsid w:val="007B4806"/>
     <w:pPr>
       <w:keepNext/>
       <w:keepLines/>
@@ -2621,10 +2898,9 @@
     <w:next w:val="Normal"/>
     <w:link w:val="Heading3Char"/>
     <w:uiPriority w:val="9"/>
-    <w:semiHidden/>
     <w:unhideWhenUsed/>
     <w:qFormat/>
-    <w:rsid w:val="0069648A"/>
+    <w:rsid w:val="007B4806"/>
     <w:pPr>
       <w:keepNext/>
       <w:keepLines/>
@@ -2647,7 +2923,7 @@
     <w:semiHidden/>
     <w:unhideWhenUsed/>
     <w:qFormat/>
-    <w:rsid w:val="0069648A"/>
+    <w:rsid w:val="007B4806"/>
     <w:pPr>
       <w:keepNext/>
       <w:keepLines/>
@@ -2670,7 +2946,7 @@
     <w:semiHidden/>
     <w:unhideWhenUsed/>
     <w:qFormat/>
-    <w:rsid w:val="0069648A"/>
+    <w:rsid w:val="007B4806"/>
     <w:pPr>
       <w:keepNext/>
       <w:keepLines/>
@@ -2691,7 +2967,7 @@
     <w:semiHidden/>
     <w:unhideWhenUsed/>
     <w:qFormat/>
-    <w:rsid w:val="0069648A"/>
+    <w:rsid w:val="007B4806"/>
     <w:pPr>
       <w:keepNext/>
       <w:keepLines/>
@@ -2714,7 +2990,7 @@
     <w:semiHidden/>
     <w:unhideWhenUsed/>
     <w:qFormat/>
-    <w:rsid w:val="0069648A"/>
+    <w:rsid w:val="007B4806"/>
     <w:pPr>
       <w:keepNext/>
       <w:keepLines/>
@@ -2735,7 +3011,7 @@
     <w:semiHidden/>
     <w:unhideWhenUsed/>
     <w:qFormat/>
-    <w:rsid w:val="0069648A"/>
+    <w:rsid w:val="007B4806"/>
     <w:pPr>
       <w:keepNext/>
       <w:keepLines/>
@@ -2758,7 +3034,7 @@
     <w:semiHidden/>
     <w:unhideWhenUsed/>
     <w:qFormat/>
-    <w:rsid w:val="0069648A"/>
+    <w:rsid w:val="007B4806"/>
     <w:pPr>
       <w:keepNext/>
       <w:keepLines/>
@@ -2802,7 +3078,7 @@
     <w:basedOn w:val="DefaultParagraphFont"/>
     <w:link w:val="Heading1"/>
     <w:uiPriority w:val="9"/>
-    <w:rsid w:val="0069648A"/>
+    <w:rsid w:val="007B4806"/>
     <w:rPr>
       <w:rFonts w:asciiTheme="majorHAnsi" w:eastAsiaTheme="majorEastAsia" w:hAnsiTheme="majorHAnsi" w:cstheme="majorBidi"/>
       <w:color w:val="0F4761" w:themeColor="accent1" w:themeShade="BF"/>
@@ -2815,7 +3091,7 @@
     <w:basedOn w:val="DefaultParagraphFont"/>
     <w:link w:val="Heading2"/>
     <w:uiPriority w:val="9"/>
-    <w:rsid w:val="0069648A"/>
+    <w:rsid w:val="007B4806"/>
     <w:rPr>
       <w:rFonts w:asciiTheme="majorHAnsi" w:eastAsiaTheme="majorEastAsia" w:hAnsiTheme="majorHAnsi" w:cstheme="majorBidi"/>
       <w:color w:val="0F4761" w:themeColor="accent1" w:themeShade="BF"/>
@@ -2828,8 +3104,7 @@
     <w:basedOn w:val="DefaultParagraphFont"/>
     <w:link w:val="Heading3"/>
     <w:uiPriority w:val="9"/>
-    <w:semiHidden/>
-    <w:rsid w:val="0069648A"/>
+    <w:rsid w:val="007B4806"/>
     <w:rPr>
       <w:rFonts w:eastAsiaTheme="majorEastAsia" w:cstheme="majorBidi"/>
       <w:color w:val="0F4761" w:themeColor="accent1" w:themeShade="BF"/>
@@ -2843,7 +3118,7 @@
     <w:link w:val="Heading4"/>
     <w:uiPriority w:val="9"/>
     <w:semiHidden/>
-    <w:rsid w:val="0069648A"/>
+    <w:rsid w:val="007B4806"/>
     <w:rPr>
       <w:rFonts w:eastAsiaTheme="majorEastAsia" w:cstheme="majorBidi"/>
       <w:i/>
@@ -2857,7 +3132,7 @@
     <w:link w:val="Heading5"/>
     <w:uiPriority w:val="9"/>
     <w:semiHidden/>
-    <w:rsid w:val="0069648A"/>
+    <w:rsid w:val="007B4806"/>
     <w:rPr>
       <w:rFonts w:eastAsiaTheme="majorEastAsia" w:cstheme="majorBidi"/>
       <w:color w:val="0F4761" w:themeColor="accent1" w:themeShade="BF"/>
@@ -2869,7 +3144,7 @@
     <w:link w:val="Heading6"/>
     <w:uiPriority w:val="9"/>
     <w:semiHidden/>
-    <w:rsid w:val="0069648A"/>
+    <w:rsid w:val="007B4806"/>
     <w:rPr>
       <w:rFonts w:eastAsiaTheme="majorEastAsia" w:cstheme="majorBidi"/>
       <w:i/>
@@ -2883,7 +3158,7 @@
     <w:link w:val="Heading7"/>
     <w:uiPriority w:val="9"/>
     <w:semiHidden/>
-    <w:rsid w:val="0069648A"/>
+    <w:rsid w:val="007B4806"/>
     <w:rPr>
       <w:rFonts w:eastAsiaTheme="majorEastAsia" w:cstheme="majorBidi"/>
       <w:color w:val="595959" w:themeColor="text1" w:themeTint="A6"/>
@@ -2895,7 +3170,7 @@
     <w:link w:val="Heading8"/>
     <w:uiPriority w:val="9"/>
     <w:semiHidden/>
-    <w:rsid w:val="0069648A"/>
+    <w:rsid w:val="007B4806"/>
     <w:rPr>
       <w:rFonts w:eastAsiaTheme="majorEastAsia" w:cstheme="majorBidi"/>
       <w:i/>
@@ -2909,7 +3184,7 @@
     <w:link w:val="Heading9"/>
     <w:uiPriority w:val="9"/>
     <w:semiHidden/>
-    <w:rsid w:val="0069648A"/>
+    <w:rsid w:val="007B4806"/>
     <w:rPr>
       <w:rFonts w:eastAsiaTheme="majorEastAsia" w:cstheme="majorBidi"/>
       <w:color w:val="272727" w:themeColor="text1" w:themeTint="D8"/>
@@ -2922,7 +3197,7 @@
     <w:link w:val="TitleChar"/>
     <w:uiPriority w:val="10"/>
     <w:qFormat/>
-    <w:rsid w:val="0069648A"/>
+    <w:rsid w:val="007B4806"/>
     <w:pPr>
       <w:spacing w:after="80" w:line="240" w:lineRule="auto"/>
       <w:contextualSpacing/>
@@ -2940,7 +3215,7 @@
     <w:basedOn w:val="DefaultParagraphFont"/>
     <w:link w:val="Title"/>
     <w:uiPriority w:val="10"/>
-    <w:rsid w:val="0069648A"/>
+    <w:rsid w:val="007B4806"/>
     <w:rPr>
       <w:rFonts w:asciiTheme="majorHAnsi" w:eastAsiaTheme="majorEastAsia" w:hAnsiTheme="majorHAnsi" w:cstheme="majorBidi"/>
       <w:spacing w:val="-10"/>
@@ -2956,7 +3231,7 @@
     <w:link w:val="SubtitleChar"/>
     <w:uiPriority w:val="11"/>
     <w:qFormat/>
-    <w:rsid w:val="0069648A"/>
+    <w:rsid w:val="007B4806"/>
     <w:pPr>
       <w:numPr>
         <w:ilvl w:val="1"/>
@@ -2975,7 +3250,7 @@
     <w:basedOn w:val="DefaultParagraphFont"/>
     <w:link w:val="Subtitle"/>
     <w:uiPriority w:val="11"/>
-    <w:rsid w:val="0069648A"/>
+    <w:rsid w:val="007B4806"/>
     <w:rPr>
       <w:rFonts w:eastAsiaTheme="majorEastAsia" w:cstheme="majorBidi"/>
       <w:color w:val="595959" w:themeColor="text1" w:themeTint="A6"/>
@@ -2991,7 +3266,7 @@
     <w:link w:val="QuoteChar"/>
     <w:uiPriority w:val="29"/>
     <w:qFormat/>
-    <w:rsid w:val="0069648A"/>
+    <w:rsid w:val="007B4806"/>
     <w:pPr>
       <w:spacing w:before="160"/>
       <w:jc w:val="center"/>
@@ -3007,7 +3282,7 @@
     <w:basedOn w:val="DefaultParagraphFont"/>
     <w:link w:val="Quote"/>
     <w:uiPriority w:val="29"/>
-    <w:rsid w:val="0069648A"/>
+    <w:rsid w:val="007B4806"/>
     <w:rPr>
       <w:i/>
       <w:iCs/>
@@ -3019,7 +3294,7 @@
     <w:basedOn w:val="Normal"/>
     <w:uiPriority w:val="34"/>
     <w:qFormat/>
-    <w:rsid w:val="0069648A"/>
+    <w:rsid w:val="007B4806"/>
     <w:pPr>
       <w:ind w:left="720"/>
       <w:contextualSpacing/>
@@ -3030,7 +3305,7 @@
     <w:basedOn w:val="DefaultParagraphFont"/>
     <w:uiPriority w:val="21"/>
     <w:qFormat/>
-    <w:rsid w:val="0069648A"/>
+    <w:rsid w:val="007B4806"/>
     <w:rPr>
       <w:i/>
       <w:iCs/>
@@ -3044,7 +3319,7 @@
     <w:link w:val="IntenseQuoteChar"/>
     <w:uiPriority w:val="30"/>
     <w:qFormat/>
-    <w:rsid w:val="0069648A"/>
+    <w:rsid w:val="007B4806"/>
     <w:pPr>
       <w:pBdr>
         <w:top w:val="single" w:sz="4" w:space="10" w:color="0F4761" w:themeColor="accent1" w:themeShade="BF"/>
@@ -3065,7 +3340,7 @@
     <w:basedOn w:val="DefaultParagraphFont"/>
     <w:link w:val="IntenseQuote"/>
     <w:uiPriority w:val="30"/>
-    <w:rsid w:val="0069648A"/>
+    <w:rsid w:val="007B4806"/>
     <w:rPr>
       <w:i/>
       <w:iCs/>
@@ -3077,7 +3352,7 @@
     <w:basedOn w:val="DefaultParagraphFont"/>
     <w:uiPriority w:val="32"/>
     <w:qFormat/>
-    <w:rsid w:val="0069648A"/>
+    <w:rsid w:val="007B4806"/>
     <w:rPr>
       <w:b/>
       <w:bCs/>
@@ -3091,7 +3366,7 @@
     <w:basedOn w:val="Normal"/>
     <w:uiPriority w:val="99"/>
     <w:unhideWhenUsed/>
-    <w:rsid w:val="0069648A"/>
+    <w:rsid w:val="007B4806"/>
     <w:pPr>
       <w:numPr>
         <w:numId w:val="1"/>

</xml_diff>

<commit_message>
mu-Toni manual: refresh Appergater and main-window captures (captioned dropdowns, metal check boxes); .docx regenerated
Refs #1611

Version: v1.1.1415

Co-Authored-By: Claude Sonnet 5.5 <noreply@anthropic.com>
</commit_message>
<xml_diff>
--- a/docs/mu-toni/mu-Toni User Manual.docx
+++ b/docs/mu-toni/mu-Toni User Manual.docx
@@ -108,10 +108,10 @@
         </w:rPr>
         <w:lastRenderedPageBreak/>
         <w:drawing>
-          <wp:inline distT="0" distB="0" distL="0" distR="0" wp14:anchorId="6BFAF515" wp14:editId="6E008C18">
+          <wp:inline distT="0" distB="0" distL="0" distR="0" wp14:anchorId="062D13ED" wp14:editId="0A30EE60">
             <wp:extent cx="5274310" cy="3340100"/>
             <wp:effectExtent l="0" t="0" r="2540" b="0"/>
-            <wp:docPr id="1364029855" name="Picture 1"/>
+            <wp:docPr id="1520476294" name="Picture 1"/>
             <wp:cNvGraphicFramePr>
               <a:graphicFrameLocks xmlns:a="http://schemas.openxmlformats.org/drawingml/2006/main" noChangeAspect="1"/>
             </wp:cNvGraphicFramePr>
@@ -119,7 +119,7 @@
               <a:graphicData uri="http://schemas.openxmlformats.org/drawingml/2006/picture">
                 <pic:pic xmlns:pic="http://schemas.openxmlformats.org/drawingml/2006/picture">
                   <pic:nvPicPr>
-                    <pic:cNvPr id="1364029855" name=""/>
+                    <pic:cNvPr id="1520476294" name=""/>
                     <pic:cNvPicPr/>
                   </pic:nvPicPr>
                   <pic:blipFill>
@@ -413,10 +413,10 @@
           <w:noProof/>
         </w:rPr>
         <w:drawing>
-          <wp:inline distT="0" distB="0" distL="0" distR="0" wp14:anchorId="3DA1719C" wp14:editId="54C3938E">
+          <wp:inline distT="0" distB="0" distL="0" distR="0" wp14:anchorId="40DF8A4E" wp14:editId="30A3779F">
             <wp:extent cx="5274310" cy="3340100"/>
             <wp:effectExtent l="0" t="0" r="2540" b="0"/>
-            <wp:docPr id="593354976" name="Picture 2"/>
+            <wp:docPr id="1194590674" name="Picture 2"/>
             <wp:cNvGraphicFramePr>
               <a:graphicFrameLocks xmlns:a="http://schemas.openxmlformats.org/drawingml/2006/main" noChangeAspect="1"/>
             </wp:cNvGraphicFramePr>
@@ -424,7 +424,7 @@
               <a:graphicData uri="http://schemas.openxmlformats.org/drawingml/2006/picture">
                 <pic:pic xmlns:pic="http://schemas.openxmlformats.org/drawingml/2006/picture">
                   <pic:nvPicPr>
-                    <pic:cNvPr id="593354976" name=""/>
+                    <pic:cNvPr id="1194590674" name=""/>
                     <pic:cNvPicPr/>
                   </pic:nvPicPr>
                   <pic:blipFill>
@@ -577,10 +577,10 @@
           <w:noProof/>
         </w:rPr>
         <w:drawing>
-          <wp:inline distT="0" distB="0" distL="0" distR="0" wp14:anchorId="5778904A" wp14:editId="3CEC6AA2">
+          <wp:inline distT="0" distB="0" distL="0" distR="0" wp14:anchorId="49AF42E0" wp14:editId="409BB60A">
             <wp:extent cx="5274310" cy="126365"/>
             <wp:effectExtent l="0" t="0" r="2540" b="6985"/>
-            <wp:docPr id="557038009" name="Picture 3"/>
+            <wp:docPr id="1131356210" name="Picture 3"/>
             <wp:cNvGraphicFramePr>
               <a:graphicFrameLocks xmlns:a="http://schemas.openxmlformats.org/drawingml/2006/main" noChangeAspect="1"/>
             </wp:cNvGraphicFramePr>
@@ -588,7 +588,7 @@
               <a:graphicData uri="http://schemas.openxmlformats.org/drawingml/2006/picture">
                 <pic:pic xmlns:pic="http://schemas.openxmlformats.org/drawingml/2006/picture">
                   <pic:nvPicPr>
-                    <pic:cNvPr id="557038009" name=""/>
+                    <pic:cNvPr id="1131356210" name=""/>
                     <pic:cNvPicPr/>
                   </pic:nvPicPr>
                   <pic:blipFill>
@@ -679,10 +679,10 @@
           <w:noProof/>
         </w:rPr>
         <w:drawing>
-          <wp:inline distT="0" distB="0" distL="0" distR="0" wp14:anchorId="346CF631" wp14:editId="50CCC54E">
+          <wp:inline distT="0" distB="0" distL="0" distR="0" wp14:anchorId="488C6C4A" wp14:editId="020F35D1">
             <wp:extent cx="446690" cy="4318000"/>
             <wp:effectExtent l="0" t="0" r="0" b="6350"/>
-            <wp:docPr id="254357315" name="Picture 4"/>
+            <wp:docPr id="1595958893" name="Picture 4"/>
             <wp:cNvGraphicFramePr>
               <a:graphicFrameLocks xmlns:a="http://schemas.openxmlformats.org/drawingml/2006/main" noChangeAspect="1"/>
             </wp:cNvGraphicFramePr>
@@ -690,7 +690,7 @@
               <a:graphicData uri="http://schemas.openxmlformats.org/drawingml/2006/picture">
                 <pic:pic xmlns:pic="http://schemas.openxmlformats.org/drawingml/2006/picture">
                   <pic:nvPicPr>
-                    <pic:cNvPr id="254357315" name=""/>
+                    <pic:cNvPr id="1595958893" name=""/>
                     <pic:cNvPicPr/>
                   </pic:nvPicPr>
                   <pic:blipFill>
@@ -1071,10 +1071,10 @@
           <w:noProof/>
         </w:rPr>
         <w:drawing>
-          <wp:inline distT="0" distB="0" distL="0" distR="0" wp14:anchorId="73AFD21B" wp14:editId="2A361CF4">
+          <wp:inline distT="0" distB="0" distL="0" distR="0" wp14:anchorId="6A1DAA67" wp14:editId="26CC11B3">
             <wp:extent cx="5274310" cy="686435"/>
             <wp:effectExtent l="0" t="0" r="2540" b="0"/>
-            <wp:docPr id="1848129112" name="Picture 5"/>
+            <wp:docPr id="511075812" name="Picture 5"/>
             <wp:cNvGraphicFramePr>
               <a:graphicFrameLocks xmlns:a="http://schemas.openxmlformats.org/drawingml/2006/main" noChangeAspect="1"/>
             </wp:cNvGraphicFramePr>
@@ -1082,7 +1082,7 @@
               <a:graphicData uri="http://schemas.openxmlformats.org/drawingml/2006/picture">
                 <pic:pic xmlns:pic="http://schemas.openxmlformats.org/drawingml/2006/picture">
                   <pic:nvPicPr>
-                    <pic:cNvPr id="1848129112" name=""/>
+                    <pic:cNvPr id="511075812" name=""/>
                     <pic:cNvPicPr/>
                   </pic:nvPicPr>
                   <pic:blipFill>
@@ -1393,10 +1393,10 @@
           <w:noProof/>
         </w:rPr>
         <w:drawing>
-          <wp:inline distT="0" distB="0" distL="0" distR="0" wp14:anchorId="443AFF3B" wp14:editId="38234A76">
+          <wp:inline distT="0" distB="0" distL="0" distR="0" wp14:anchorId="09DE2AA2" wp14:editId="73A94A7E">
             <wp:extent cx="5274310" cy="701040"/>
             <wp:effectExtent l="0" t="0" r="2540" b="3810"/>
-            <wp:docPr id="1301642815" name="Picture 6"/>
+            <wp:docPr id="524091827" name="Picture 6"/>
             <wp:cNvGraphicFramePr>
               <a:graphicFrameLocks xmlns:a="http://schemas.openxmlformats.org/drawingml/2006/main" noChangeAspect="1"/>
             </wp:cNvGraphicFramePr>
@@ -1404,7 +1404,7 @@
               <a:graphicData uri="http://schemas.openxmlformats.org/drawingml/2006/picture">
                 <pic:pic xmlns:pic="http://schemas.openxmlformats.org/drawingml/2006/picture">
                   <pic:nvPicPr>
-                    <pic:cNvPr id="1301642815" name=""/>
+                    <pic:cNvPr id="524091827" name=""/>
                     <pic:cNvPicPr/>
                   </pic:nvPicPr>
                   <pic:blipFill>
@@ -1481,10 +1481,10 @@
           <w:noProof/>
         </w:rPr>
         <w:drawing>
-          <wp:inline distT="0" distB="0" distL="0" distR="0" wp14:anchorId="41709F59" wp14:editId="1423AFFD">
+          <wp:inline distT="0" distB="0" distL="0" distR="0" wp14:anchorId="38D2E6E5" wp14:editId="430360E7">
             <wp:extent cx="5274310" cy="1386840"/>
             <wp:effectExtent l="0" t="0" r="2540" b="3810"/>
-            <wp:docPr id="355288909" name="Picture 7"/>
+            <wp:docPr id="2124319307" name="Picture 7"/>
             <wp:cNvGraphicFramePr>
               <a:graphicFrameLocks xmlns:a="http://schemas.openxmlformats.org/drawingml/2006/main" noChangeAspect="1"/>
             </wp:cNvGraphicFramePr>
@@ -1492,7 +1492,7 @@
               <a:graphicData uri="http://schemas.openxmlformats.org/drawingml/2006/picture">
                 <pic:pic xmlns:pic="http://schemas.openxmlformats.org/drawingml/2006/picture">
                   <pic:nvPicPr>
-                    <pic:cNvPr id="355288909" name=""/>
+                    <pic:cNvPr id="2124319307" name=""/>
                     <pic:cNvPicPr/>
                   </pic:nvPicPr>
                   <pic:blipFill>
@@ -1599,10 +1599,10 @@
           <w:noProof/>
         </w:rPr>
         <w:drawing>
-          <wp:inline distT="0" distB="0" distL="0" distR="0" wp14:anchorId="35A1C769" wp14:editId="71F30C17">
+          <wp:inline distT="0" distB="0" distL="0" distR="0" wp14:anchorId="2483C81F" wp14:editId="1F7412D6">
             <wp:extent cx="5274310" cy="3340100"/>
             <wp:effectExtent l="0" t="0" r="2540" b="0"/>
-            <wp:docPr id="1218983152" name="Picture 8"/>
+            <wp:docPr id="1847585812" name="Picture 8"/>
             <wp:cNvGraphicFramePr>
               <a:graphicFrameLocks xmlns:a="http://schemas.openxmlformats.org/drawingml/2006/main" noChangeAspect="1"/>
             </wp:cNvGraphicFramePr>
@@ -1610,7 +1610,7 @@
               <a:graphicData uri="http://schemas.openxmlformats.org/drawingml/2006/picture">
                 <pic:pic xmlns:pic="http://schemas.openxmlformats.org/drawingml/2006/picture">
                   <pic:nvPicPr>
-                    <pic:cNvPr id="1218983152" name=""/>
+                    <pic:cNvPr id="1847585812" name=""/>
                     <pic:cNvPicPr/>
                   </pic:nvPicPr>
                   <pic:blipFill>
@@ -1820,10 +1820,10 @@
           <w:noProof/>
         </w:rPr>
         <w:drawing>
-          <wp:inline distT="0" distB="0" distL="0" distR="0" wp14:anchorId="45103C0D" wp14:editId="195D3A70">
+          <wp:inline distT="0" distB="0" distL="0" distR="0" wp14:anchorId="322B3D17" wp14:editId="2E2CD1DF">
             <wp:extent cx="4716782" cy="343039"/>
             <wp:effectExtent l="0" t="0" r="0" b="0"/>
-            <wp:docPr id="263682242" name="Picture 9"/>
+            <wp:docPr id="1521653252" name="Picture 9"/>
             <wp:cNvGraphicFramePr>
               <a:graphicFrameLocks xmlns:a="http://schemas.openxmlformats.org/drawingml/2006/main" noChangeAspect="1"/>
             </wp:cNvGraphicFramePr>
@@ -1831,7 +1831,7 @@
               <a:graphicData uri="http://schemas.openxmlformats.org/drawingml/2006/picture">
                 <pic:pic xmlns:pic="http://schemas.openxmlformats.org/drawingml/2006/picture">
                   <pic:nvPicPr>
-                    <pic:cNvPr id="263682242" name=""/>
+                    <pic:cNvPr id="1521653252" name=""/>
                     <pic:cNvPicPr/>
                   </pic:nvPicPr>
                   <pic:blipFill>
@@ -1964,10 +1964,10 @@
           <w:noProof/>
         </w:rPr>
         <w:drawing>
-          <wp:inline distT="0" distB="0" distL="0" distR="0" wp14:anchorId="0365EE31" wp14:editId="6CAADD27">
+          <wp:inline distT="0" distB="0" distL="0" distR="0" wp14:anchorId="3DD52C9F" wp14:editId="27C08326">
             <wp:extent cx="5274310" cy="3340100"/>
             <wp:effectExtent l="0" t="0" r="2540" b="0"/>
-            <wp:docPr id="1887474689" name="Picture 10"/>
+            <wp:docPr id="972519216" name="Picture 10"/>
             <wp:cNvGraphicFramePr>
               <a:graphicFrameLocks xmlns:a="http://schemas.openxmlformats.org/drawingml/2006/main" noChangeAspect="1"/>
             </wp:cNvGraphicFramePr>
@@ -1975,7 +1975,7 @@
               <a:graphicData uri="http://schemas.openxmlformats.org/drawingml/2006/picture">
                 <pic:pic xmlns:pic="http://schemas.openxmlformats.org/drawingml/2006/picture">
                   <pic:nvPicPr>
-                    <pic:cNvPr id="1887474689" name=""/>
+                    <pic:cNvPr id="972519216" name=""/>
                     <pic:cNvPicPr/>
                   </pic:nvPicPr>
                   <pic:blipFill>
@@ -2101,10 +2101,10 @@
           <w:noProof/>
         </w:rPr>
         <w:drawing>
-          <wp:inline distT="0" distB="0" distL="0" distR="0" wp14:anchorId="15E8F433" wp14:editId="289B6628">
+          <wp:inline distT="0" distB="0" distL="0" distR="0" wp14:anchorId="1F6ABC25" wp14:editId="29D33C64">
             <wp:extent cx="5274310" cy="147320"/>
             <wp:effectExtent l="0" t="0" r="2540" b="5080"/>
-            <wp:docPr id="1380810823" name="Picture 11"/>
+            <wp:docPr id="1129322931" name="Picture 11"/>
             <wp:cNvGraphicFramePr>
               <a:graphicFrameLocks xmlns:a="http://schemas.openxmlformats.org/drawingml/2006/main" noChangeAspect="1"/>
             </wp:cNvGraphicFramePr>
@@ -2112,7 +2112,7 @@
               <a:graphicData uri="http://schemas.openxmlformats.org/drawingml/2006/picture">
                 <pic:pic xmlns:pic="http://schemas.openxmlformats.org/drawingml/2006/picture">
                   <pic:nvPicPr>
-                    <pic:cNvPr id="1380810823" name=""/>
+                    <pic:cNvPr id="1129322931" name=""/>
                     <pic:cNvPicPr/>
                   </pic:nvPicPr>
                   <pic:blipFill>
@@ -2245,10 +2245,10 @@
         </w:rPr>
         <w:lastRenderedPageBreak/>
         <w:drawing>
-          <wp:inline distT="0" distB="0" distL="0" distR="0" wp14:anchorId="24F51615" wp14:editId="32740974">
+          <wp:inline distT="0" distB="0" distL="0" distR="0" wp14:anchorId="74F09963" wp14:editId="56E4FD38">
             <wp:extent cx="5274310" cy="3340100"/>
             <wp:effectExtent l="0" t="0" r="2540" b="0"/>
-            <wp:docPr id="234544650" name="Picture 12"/>
+            <wp:docPr id="1173109190" name="Picture 12"/>
             <wp:cNvGraphicFramePr>
               <a:graphicFrameLocks xmlns:a="http://schemas.openxmlformats.org/drawingml/2006/main" noChangeAspect="1"/>
             </wp:cNvGraphicFramePr>
@@ -2256,7 +2256,7 @@
               <a:graphicData uri="http://schemas.openxmlformats.org/drawingml/2006/picture">
                 <pic:pic xmlns:pic="http://schemas.openxmlformats.org/drawingml/2006/picture">
                   <pic:nvPicPr>
-                    <pic:cNvPr id="234544650" name=""/>
+                    <pic:cNvPr id="1173109190" name=""/>
                     <pic:cNvPicPr/>
                   </pic:nvPicPr>
                   <pic:blipFill>
@@ -2386,10 +2386,10 @@
           <w:noProof/>
         </w:rPr>
         <w:drawing>
-          <wp:inline distT="0" distB="0" distL="0" distR="0" wp14:anchorId="11007496" wp14:editId="6BCDED0A">
+          <wp:inline distT="0" distB="0" distL="0" distR="0" wp14:anchorId="153388F3" wp14:editId="08E2E267">
             <wp:extent cx="5274310" cy="277495"/>
             <wp:effectExtent l="0" t="0" r="2540" b="8255"/>
-            <wp:docPr id="1003306570" name="Picture 13"/>
+            <wp:docPr id="2131312541" name="Picture 13"/>
             <wp:cNvGraphicFramePr>
               <a:graphicFrameLocks xmlns:a="http://schemas.openxmlformats.org/drawingml/2006/main" noChangeAspect="1"/>
             </wp:cNvGraphicFramePr>
@@ -2397,7 +2397,7 @@
               <a:graphicData uri="http://schemas.openxmlformats.org/drawingml/2006/picture">
                 <pic:pic xmlns:pic="http://schemas.openxmlformats.org/drawingml/2006/picture">
                   <pic:nvPicPr>
-                    <pic:cNvPr id="1003306570" name=""/>
+                    <pic:cNvPr id="2131312541" name=""/>
                     <pic:cNvPicPr/>
                   </pic:nvPicPr>
                   <pic:blipFill>
@@ -2690,7 +2690,7 @@
   <w:abstractNum w:abstractNumId="0" w15:restartNumberingAfterBreak="0">
     <w:nsid w:val="FFFFFF89"/>
     <w:multiLevelType w:val="singleLevel"/>
-    <w:tmpl w:val="AE6AC0BC"/>
+    <w:tmpl w:val="DB74843E"/>
     <w:lvl w:ilvl="0">
       <w:start w:val="1"/>
       <w:numFmt w:val="bullet"/>
@@ -2708,7 +2708,7 @@
       </w:rPr>
     </w:lvl>
   </w:abstractNum>
-  <w:num w:numId="1" w16cid:durableId="103774428">
+  <w:num w:numId="1" w16cid:durableId="826628124">
     <w:abstractNumId w:val="0"/>
   </w:num>
 </w:numbering>
@@ -3122,7 +3122,7 @@
     <w:link w:val="Heading1Char"/>
     <w:uiPriority w:val="9"/>
     <w:qFormat/>
-    <w:rsid w:val="00F238C8"/>
+    <w:rsid w:val="00AF21B2"/>
     <w:pPr>
       <w:keepNext/>
       <w:keepLines/>
@@ -3144,7 +3144,7 @@
     <w:uiPriority w:val="9"/>
     <w:unhideWhenUsed/>
     <w:qFormat/>
-    <w:rsid w:val="00F238C8"/>
+    <w:rsid w:val="00AF21B2"/>
     <w:pPr>
       <w:keepNext/>
       <w:keepLines/>
@@ -3166,7 +3166,7 @@
     <w:uiPriority w:val="9"/>
     <w:unhideWhenUsed/>
     <w:qFormat/>
-    <w:rsid w:val="00F238C8"/>
+    <w:rsid w:val="00AF21B2"/>
     <w:pPr>
       <w:keepNext/>
       <w:keepLines/>
@@ -3189,7 +3189,7 @@
     <w:semiHidden/>
     <w:unhideWhenUsed/>
     <w:qFormat/>
-    <w:rsid w:val="00F238C8"/>
+    <w:rsid w:val="00AF21B2"/>
     <w:pPr>
       <w:keepNext/>
       <w:keepLines/>
@@ -3212,7 +3212,7 @@
     <w:semiHidden/>
     <w:unhideWhenUsed/>
     <w:qFormat/>
-    <w:rsid w:val="00F238C8"/>
+    <w:rsid w:val="00AF21B2"/>
     <w:pPr>
       <w:keepNext/>
       <w:keepLines/>
@@ -3233,7 +3233,7 @@
     <w:semiHidden/>
     <w:unhideWhenUsed/>
     <w:qFormat/>
-    <w:rsid w:val="00F238C8"/>
+    <w:rsid w:val="00AF21B2"/>
     <w:pPr>
       <w:keepNext/>
       <w:keepLines/>
@@ -3256,7 +3256,7 @@
     <w:semiHidden/>
     <w:unhideWhenUsed/>
     <w:qFormat/>
-    <w:rsid w:val="00F238C8"/>
+    <w:rsid w:val="00AF21B2"/>
     <w:pPr>
       <w:keepNext/>
       <w:keepLines/>
@@ -3277,7 +3277,7 @@
     <w:semiHidden/>
     <w:unhideWhenUsed/>
     <w:qFormat/>
-    <w:rsid w:val="00F238C8"/>
+    <w:rsid w:val="00AF21B2"/>
     <w:pPr>
       <w:keepNext/>
       <w:keepLines/>
@@ -3300,7 +3300,7 @@
     <w:semiHidden/>
     <w:unhideWhenUsed/>
     <w:qFormat/>
-    <w:rsid w:val="00F238C8"/>
+    <w:rsid w:val="00AF21B2"/>
     <w:pPr>
       <w:keepNext/>
       <w:keepLines/>
@@ -3344,7 +3344,7 @@
     <w:basedOn w:val="DefaultParagraphFont"/>
     <w:link w:val="Heading1"/>
     <w:uiPriority w:val="9"/>
-    <w:rsid w:val="00F238C8"/>
+    <w:rsid w:val="00AF21B2"/>
     <w:rPr>
       <w:rFonts w:asciiTheme="majorHAnsi" w:eastAsiaTheme="majorEastAsia" w:hAnsiTheme="majorHAnsi" w:cstheme="majorBidi"/>
       <w:color w:val="0F4761" w:themeColor="accent1" w:themeShade="BF"/>
@@ -3357,7 +3357,7 @@
     <w:basedOn w:val="DefaultParagraphFont"/>
     <w:link w:val="Heading2"/>
     <w:uiPriority w:val="9"/>
-    <w:rsid w:val="00F238C8"/>
+    <w:rsid w:val="00AF21B2"/>
     <w:rPr>
       <w:rFonts w:asciiTheme="majorHAnsi" w:eastAsiaTheme="majorEastAsia" w:hAnsiTheme="majorHAnsi" w:cstheme="majorBidi"/>
       <w:color w:val="0F4761" w:themeColor="accent1" w:themeShade="BF"/>
@@ -3370,7 +3370,7 @@
     <w:basedOn w:val="DefaultParagraphFont"/>
     <w:link w:val="Heading3"/>
     <w:uiPriority w:val="9"/>
-    <w:rsid w:val="00F238C8"/>
+    <w:rsid w:val="00AF21B2"/>
     <w:rPr>
       <w:rFonts w:eastAsiaTheme="majorEastAsia" w:cstheme="majorBidi"/>
       <w:color w:val="0F4761" w:themeColor="accent1" w:themeShade="BF"/>
@@ -3384,7 +3384,7 @@
     <w:link w:val="Heading4"/>
     <w:uiPriority w:val="9"/>
     <w:semiHidden/>
-    <w:rsid w:val="00F238C8"/>
+    <w:rsid w:val="00AF21B2"/>
     <w:rPr>
       <w:rFonts w:eastAsiaTheme="majorEastAsia" w:cstheme="majorBidi"/>
       <w:i/>
@@ -3398,7 +3398,7 @@
     <w:link w:val="Heading5"/>
     <w:uiPriority w:val="9"/>
     <w:semiHidden/>
-    <w:rsid w:val="00F238C8"/>
+    <w:rsid w:val="00AF21B2"/>
     <w:rPr>
       <w:rFonts w:eastAsiaTheme="majorEastAsia" w:cstheme="majorBidi"/>
       <w:color w:val="0F4761" w:themeColor="accent1" w:themeShade="BF"/>
@@ -3410,7 +3410,7 @@
     <w:link w:val="Heading6"/>
     <w:uiPriority w:val="9"/>
     <w:semiHidden/>
-    <w:rsid w:val="00F238C8"/>
+    <w:rsid w:val="00AF21B2"/>
     <w:rPr>
       <w:rFonts w:eastAsiaTheme="majorEastAsia" w:cstheme="majorBidi"/>
       <w:i/>
@@ -3424,7 +3424,7 @@
     <w:link w:val="Heading7"/>
     <w:uiPriority w:val="9"/>
     <w:semiHidden/>
-    <w:rsid w:val="00F238C8"/>
+    <w:rsid w:val="00AF21B2"/>
     <w:rPr>
       <w:rFonts w:eastAsiaTheme="majorEastAsia" w:cstheme="majorBidi"/>
       <w:color w:val="595959" w:themeColor="text1" w:themeTint="A6"/>
@@ -3436,7 +3436,7 @@
     <w:link w:val="Heading8"/>
     <w:uiPriority w:val="9"/>
     <w:semiHidden/>
-    <w:rsid w:val="00F238C8"/>
+    <w:rsid w:val="00AF21B2"/>
     <w:rPr>
       <w:rFonts w:eastAsiaTheme="majorEastAsia" w:cstheme="majorBidi"/>
       <w:i/>
@@ -3450,7 +3450,7 @@
     <w:link w:val="Heading9"/>
     <w:uiPriority w:val="9"/>
     <w:semiHidden/>
-    <w:rsid w:val="00F238C8"/>
+    <w:rsid w:val="00AF21B2"/>
     <w:rPr>
       <w:rFonts w:eastAsiaTheme="majorEastAsia" w:cstheme="majorBidi"/>
       <w:color w:val="272727" w:themeColor="text1" w:themeTint="D8"/>
@@ -3463,7 +3463,7 @@
     <w:link w:val="TitleChar"/>
     <w:uiPriority w:val="10"/>
     <w:qFormat/>
-    <w:rsid w:val="00F238C8"/>
+    <w:rsid w:val="00AF21B2"/>
     <w:pPr>
       <w:spacing w:after="80" w:line="240" w:lineRule="auto"/>
       <w:contextualSpacing/>
@@ -3481,7 +3481,7 @@
     <w:basedOn w:val="DefaultParagraphFont"/>
     <w:link w:val="Title"/>
     <w:uiPriority w:val="10"/>
-    <w:rsid w:val="00F238C8"/>
+    <w:rsid w:val="00AF21B2"/>
     <w:rPr>
       <w:rFonts w:asciiTheme="majorHAnsi" w:eastAsiaTheme="majorEastAsia" w:hAnsiTheme="majorHAnsi" w:cstheme="majorBidi"/>
       <w:spacing w:val="-10"/>
@@ -3497,7 +3497,7 @@
     <w:link w:val="SubtitleChar"/>
     <w:uiPriority w:val="11"/>
     <w:qFormat/>
-    <w:rsid w:val="00F238C8"/>
+    <w:rsid w:val="00AF21B2"/>
     <w:pPr>
       <w:numPr>
         <w:ilvl w:val="1"/>
@@ -3516,7 +3516,7 @@
     <w:basedOn w:val="DefaultParagraphFont"/>
     <w:link w:val="Subtitle"/>
     <w:uiPriority w:val="11"/>
-    <w:rsid w:val="00F238C8"/>
+    <w:rsid w:val="00AF21B2"/>
     <w:rPr>
       <w:rFonts w:eastAsiaTheme="majorEastAsia" w:cstheme="majorBidi"/>
       <w:color w:val="595959" w:themeColor="text1" w:themeTint="A6"/>
@@ -3532,7 +3532,7 @@
     <w:link w:val="QuoteChar"/>
     <w:uiPriority w:val="29"/>
     <w:qFormat/>
-    <w:rsid w:val="00F238C8"/>
+    <w:rsid w:val="00AF21B2"/>
     <w:pPr>
       <w:spacing w:before="160"/>
       <w:jc w:val="center"/>
@@ -3548,7 +3548,7 @@
     <w:basedOn w:val="DefaultParagraphFont"/>
     <w:link w:val="Quote"/>
     <w:uiPriority w:val="29"/>
-    <w:rsid w:val="00F238C8"/>
+    <w:rsid w:val="00AF21B2"/>
     <w:rPr>
       <w:i/>
       <w:iCs/>
@@ -3560,7 +3560,7 @@
     <w:basedOn w:val="Normal"/>
     <w:uiPriority w:val="34"/>
     <w:qFormat/>
-    <w:rsid w:val="00F238C8"/>
+    <w:rsid w:val="00AF21B2"/>
     <w:pPr>
       <w:ind w:left="720"/>
       <w:contextualSpacing/>
@@ -3571,7 +3571,7 @@
     <w:basedOn w:val="DefaultParagraphFont"/>
     <w:uiPriority w:val="21"/>
     <w:qFormat/>
-    <w:rsid w:val="00F238C8"/>
+    <w:rsid w:val="00AF21B2"/>
     <w:rPr>
       <w:i/>
       <w:iCs/>
@@ -3585,7 +3585,7 @@
     <w:link w:val="IntenseQuoteChar"/>
     <w:uiPriority w:val="30"/>
     <w:qFormat/>
-    <w:rsid w:val="00F238C8"/>
+    <w:rsid w:val="00AF21B2"/>
     <w:pPr>
       <w:pBdr>
         <w:top w:val="single" w:sz="4" w:space="10" w:color="0F4761" w:themeColor="accent1" w:themeShade="BF"/>
@@ -3606,7 +3606,7 @@
     <w:basedOn w:val="DefaultParagraphFont"/>
     <w:link w:val="IntenseQuote"/>
     <w:uiPriority w:val="30"/>
-    <w:rsid w:val="00F238C8"/>
+    <w:rsid w:val="00AF21B2"/>
     <w:rPr>
       <w:i/>
       <w:iCs/>
@@ -3618,7 +3618,7 @@
     <w:basedOn w:val="DefaultParagraphFont"/>
     <w:uiPriority w:val="32"/>
     <w:qFormat/>
-    <w:rsid w:val="00F238C8"/>
+    <w:rsid w:val="00AF21B2"/>
     <w:rPr>
       <w:b/>
       <w:bCs/>
@@ -3632,7 +3632,7 @@
     <w:basedOn w:val="Normal"/>
     <w:uiPriority w:val="99"/>
     <w:unhideWhenUsed/>
-    <w:rsid w:val="00F238C8"/>
+    <w:rsid w:val="00AF21B2"/>
     <w:pPr>
       <w:numPr>
         <w:numId w:val="1"/>

</xml_diff>

<commit_message>
Manuals: mu-Toni screenshots refreshed from Release v1.1.0.1450 (all 12 images), manual regenerated
Refs: mu-Toni manual screenshot refresh.

Co-Authored-By: Claude Sonnet 5.5 <noreply@anthropic.com>
</commit_message>
<xml_diff>
--- a/docs/mu-toni/mu-Toni User Manual.docx
+++ b/docs/mu-toni/mu-Toni User Manual.docx
@@ -108,10 +108,10 @@
         </w:rPr>
         <w:lastRenderedPageBreak/>
         <w:drawing>
-          <wp:inline distT="0" distB="0" distL="0" distR="0" wp14:anchorId="46E650FE" wp14:editId="05C0759E">
+          <wp:inline distT="0" distB="0" distL="0" distR="0" wp14:anchorId="4D3AC167" wp14:editId="3F88C1DC">
             <wp:extent cx="5274310" cy="3340100"/>
             <wp:effectExtent l="0" t="0" r="2540" b="0"/>
-            <wp:docPr id="740851127" name="Picture 1"/>
+            <wp:docPr id="1140002215" name="Picture 1"/>
             <wp:cNvGraphicFramePr>
               <a:graphicFrameLocks xmlns:a="http://schemas.openxmlformats.org/drawingml/2006/main" noChangeAspect="1"/>
             </wp:cNvGraphicFramePr>
@@ -119,7 +119,7 @@
               <a:graphicData uri="http://schemas.openxmlformats.org/drawingml/2006/picture">
                 <pic:pic xmlns:pic="http://schemas.openxmlformats.org/drawingml/2006/picture">
                   <pic:nvPicPr>
-                    <pic:cNvPr id="740851127" name=""/>
+                    <pic:cNvPr id="1140002215" name=""/>
                     <pic:cNvPicPr/>
                   </pic:nvPicPr>
                   <pic:blipFill>
@@ -415,10 +415,10 @@
           <w:noProof/>
         </w:rPr>
         <w:drawing>
-          <wp:inline distT="0" distB="0" distL="0" distR="0" wp14:anchorId="61A78631" wp14:editId="640A99F0">
+          <wp:inline distT="0" distB="0" distL="0" distR="0" wp14:anchorId="7EF86C81" wp14:editId="4F9FC656">
             <wp:extent cx="5274310" cy="3340100"/>
             <wp:effectExtent l="0" t="0" r="2540" b="0"/>
-            <wp:docPr id="1220587845" name="Picture 2"/>
+            <wp:docPr id="940476886" name="Picture 2"/>
             <wp:cNvGraphicFramePr>
               <a:graphicFrameLocks xmlns:a="http://schemas.openxmlformats.org/drawingml/2006/main" noChangeAspect="1"/>
             </wp:cNvGraphicFramePr>
@@ -426,7 +426,7 @@
               <a:graphicData uri="http://schemas.openxmlformats.org/drawingml/2006/picture">
                 <pic:pic xmlns:pic="http://schemas.openxmlformats.org/drawingml/2006/picture">
                   <pic:nvPicPr>
-                    <pic:cNvPr id="1220587845" name=""/>
+                    <pic:cNvPr id="940476886" name=""/>
                     <pic:cNvPicPr/>
                   </pic:nvPicPr>
                   <pic:blipFill>
@@ -577,10 +577,10 @@
           <w:noProof/>
         </w:rPr>
         <w:drawing>
-          <wp:inline distT="0" distB="0" distL="0" distR="0" wp14:anchorId="7E58EA10" wp14:editId="6596C4D9">
+          <wp:inline distT="0" distB="0" distL="0" distR="0" wp14:anchorId="2027A054" wp14:editId="6A0EAA15">
             <wp:extent cx="5274310" cy="126365"/>
             <wp:effectExtent l="0" t="0" r="2540" b="6985"/>
-            <wp:docPr id="1803624366" name="Picture 3"/>
+            <wp:docPr id="1789845167" name="Picture 3"/>
             <wp:cNvGraphicFramePr>
               <a:graphicFrameLocks xmlns:a="http://schemas.openxmlformats.org/drawingml/2006/main" noChangeAspect="1"/>
             </wp:cNvGraphicFramePr>
@@ -588,7 +588,7 @@
               <a:graphicData uri="http://schemas.openxmlformats.org/drawingml/2006/picture">
                 <pic:pic xmlns:pic="http://schemas.openxmlformats.org/drawingml/2006/picture">
                   <pic:nvPicPr>
-                    <pic:cNvPr id="1803624366" name=""/>
+                    <pic:cNvPr id="1789845167" name=""/>
                     <pic:cNvPicPr/>
                   </pic:nvPicPr>
                   <pic:blipFill>
@@ -679,10 +679,10 @@
         </w:rPr>
         <w:lastRenderedPageBreak/>
         <w:drawing>
-          <wp:inline distT="0" distB="0" distL="0" distR="0" wp14:anchorId="7E4ABB37" wp14:editId="51D501BA">
+          <wp:inline distT="0" distB="0" distL="0" distR="0" wp14:anchorId="138229EF" wp14:editId="766443ED">
             <wp:extent cx="446690" cy="4318000"/>
             <wp:effectExtent l="0" t="0" r="0" b="6350"/>
-            <wp:docPr id="894172912" name="Picture 4"/>
+            <wp:docPr id="856173144" name="Picture 4"/>
             <wp:cNvGraphicFramePr>
               <a:graphicFrameLocks xmlns:a="http://schemas.openxmlformats.org/drawingml/2006/main" noChangeAspect="1"/>
             </wp:cNvGraphicFramePr>
@@ -690,7 +690,7 @@
               <a:graphicData uri="http://schemas.openxmlformats.org/drawingml/2006/picture">
                 <pic:pic xmlns:pic="http://schemas.openxmlformats.org/drawingml/2006/picture">
                   <pic:nvPicPr>
-                    <pic:cNvPr id="894172912" name=""/>
+                    <pic:cNvPr id="856173144" name=""/>
                     <pic:cNvPicPr/>
                   </pic:nvPicPr>
                   <pic:blipFill>
@@ -1068,10 +1068,10 @@
           <w:noProof/>
         </w:rPr>
         <w:drawing>
-          <wp:inline distT="0" distB="0" distL="0" distR="0" wp14:anchorId="6F8BE4B8" wp14:editId="185EF218">
-            <wp:extent cx="5274310" cy="686435"/>
+          <wp:inline distT="0" distB="0" distL="0" distR="0" wp14:anchorId="0B5D8124" wp14:editId="14A6F0F6">
+            <wp:extent cx="5274310" cy="687070"/>
             <wp:effectExtent l="0" t="0" r="2540" b="0"/>
-            <wp:docPr id="1496170649" name="Picture 5"/>
+            <wp:docPr id="647572131" name="Picture 5"/>
             <wp:cNvGraphicFramePr>
               <a:graphicFrameLocks xmlns:a="http://schemas.openxmlformats.org/drawingml/2006/main" noChangeAspect="1"/>
             </wp:cNvGraphicFramePr>
@@ -1079,7 +1079,7 @@
               <a:graphicData uri="http://schemas.openxmlformats.org/drawingml/2006/picture">
                 <pic:pic xmlns:pic="http://schemas.openxmlformats.org/drawingml/2006/picture">
                   <pic:nvPicPr>
-                    <pic:cNvPr id="1496170649" name=""/>
+                    <pic:cNvPr id="647572131" name=""/>
                     <pic:cNvPicPr/>
                   </pic:nvPicPr>
                   <pic:blipFill>
@@ -1097,7 +1097,7 @@
                   <pic:spPr>
                     <a:xfrm>
                       <a:off x="0" y="0"/>
-                      <a:ext cx="5274310" cy="686435"/>
+                      <a:ext cx="5274310" cy="687070"/>
                     </a:xfrm>
                     <a:prstGeom prst="rect">
                       <a:avLst/>
@@ -1390,10 +1390,10 @@
           <w:noProof/>
         </w:rPr>
         <w:drawing>
-          <wp:inline distT="0" distB="0" distL="0" distR="0" wp14:anchorId="489394D5" wp14:editId="64608337">
-            <wp:extent cx="5274310" cy="701040"/>
-            <wp:effectExtent l="0" t="0" r="2540" b="3810"/>
-            <wp:docPr id="720727799" name="Picture 6"/>
+          <wp:inline distT="0" distB="0" distL="0" distR="0" wp14:anchorId="216C279A" wp14:editId="348193C5">
+            <wp:extent cx="5274310" cy="700405"/>
+            <wp:effectExtent l="0" t="0" r="2540" b="4445"/>
+            <wp:docPr id="1023731305" name="Picture 6"/>
             <wp:cNvGraphicFramePr>
               <a:graphicFrameLocks xmlns:a="http://schemas.openxmlformats.org/drawingml/2006/main" noChangeAspect="1"/>
             </wp:cNvGraphicFramePr>
@@ -1401,7 +1401,7 @@
               <a:graphicData uri="http://schemas.openxmlformats.org/drawingml/2006/picture">
                 <pic:pic xmlns:pic="http://schemas.openxmlformats.org/drawingml/2006/picture">
                   <pic:nvPicPr>
-                    <pic:cNvPr id="720727799" name=""/>
+                    <pic:cNvPr id="1023731305" name=""/>
                     <pic:cNvPicPr/>
                   </pic:nvPicPr>
                   <pic:blipFill>
@@ -1419,7 +1419,7 @@
                   <pic:spPr>
                     <a:xfrm>
                       <a:off x="0" y="0"/>
-                      <a:ext cx="5274310" cy="701040"/>
+                      <a:ext cx="5274310" cy="700405"/>
                     </a:xfrm>
                     <a:prstGeom prst="rect">
                       <a:avLst/>
@@ -1478,10 +1478,10 @@
           <w:noProof/>
         </w:rPr>
         <w:drawing>
-          <wp:inline distT="0" distB="0" distL="0" distR="0" wp14:anchorId="11EBC991" wp14:editId="3EAF4114">
-            <wp:extent cx="5274310" cy="1386840"/>
-            <wp:effectExtent l="0" t="0" r="2540" b="3810"/>
-            <wp:docPr id="217436048" name="Picture 7"/>
+          <wp:inline distT="0" distB="0" distL="0" distR="0" wp14:anchorId="61847831" wp14:editId="42543BA9">
+            <wp:extent cx="5274310" cy="1386205"/>
+            <wp:effectExtent l="0" t="0" r="2540" b="4445"/>
+            <wp:docPr id="1452140205" name="Picture 7"/>
             <wp:cNvGraphicFramePr>
               <a:graphicFrameLocks xmlns:a="http://schemas.openxmlformats.org/drawingml/2006/main" noChangeAspect="1"/>
             </wp:cNvGraphicFramePr>
@@ -1489,7 +1489,7 @@
               <a:graphicData uri="http://schemas.openxmlformats.org/drawingml/2006/picture">
                 <pic:pic xmlns:pic="http://schemas.openxmlformats.org/drawingml/2006/picture">
                   <pic:nvPicPr>
-                    <pic:cNvPr id="217436048" name=""/>
+                    <pic:cNvPr id="1452140205" name=""/>
                     <pic:cNvPicPr/>
                   </pic:nvPicPr>
                   <pic:blipFill>
@@ -1507,7 +1507,7 @@
                   <pic:spPr>
                     <a:xfrm>
                       <a:off x="0" y="0"/>
-                      <a:ext cx="5274310" cy="1386840"/>
+                      <a:ext cx="5274310" cy="1386205"/>
                     </a:xfrm>
                     <a:prstGeom prst="rect">
                       <a:avLst/>
@@ -1596,10 +1596,10 @@
           <w:noProof/>
         </w:rPr>
         <w:drawing>
-          <wp:inline distT="0" distB="0" distL="0" distR="0" wp14:anchorId="42E4BC67" wp14:editId="53B0BF7F">
+          <wp:inline distT="0" distB="0" distL="0" distR="0" wp14:anchorId="6FBE3358" wp14:editId="39AD243E">
             <wp:extent cx="5274310" cy="3340100"/>
             <wp:effectExtent l="0" t="0" r="2540" b="0"/>
-            <wp:docPr id="2142541960" name="Picture 8"/>
+            <wp:docPr id="1222155999" name="Picture 8"/>
             <wp:cNvGraphicFramePr>
               <a:graphicFrameLocks xmlns:a="http://schemas.openxmlformats.org/drawingml/2006/main" noChangeAspect="1"/>
             </wp:cNvGraphicFramePr>
@@ -1607,7 +1607,7 @@
               <a:graphicData uri="http://schemas.openxmlformats.org/drawingml/2006/picture">
                 <pic:pic xmlns:pic="http://schemas.openxmlformats.org/drawingml/2006/picture">
                   <pic:nvPicPr>
-                    <pic:cNvPr id="2142541960" name=""/>
+                    <pic:cNvPr id="1222155999" name=""/>
                     <pic:cNvPicPr/>
                   </pic:nvPicPr>
                   <pic:blipFill>
@@ -1814,10 +1814,10 @@
         </w:rPr>
         <w:lastRenderedPageBreak/>
         <w:drawing>
-          <wp:inline distT="0" distB="0" distL="0" distR="0" wp14:anchorId="47CFF5A0" wp14:editId="228E8A9B">
-            <wp:extent cx="4716782" cy="343039"/>
+          <wp:inline distT="0" distB="0" distL="0" distR="0" wp14:anchorId="22A23120" wp14:editId="0CFB575F">
+            <wp:extent cx="4715533" cy="342948"/>
             <wp:effectExtent l="0" t="0" r="0" b="0"/>
-            <wp:docPr id="766921731" name="Picture 9"/>
+            <wp:docPr id="29242898" name="Picture 9"/>
             <wp:cNvGraphicFramePr>
               <a:graphicFrameLocks xmlns:a="http://schemas.openxmlformats.org/drawingml/2006/main" noChangeAspect="1"/>
             </wp:cNvGraphicFramePr>
@@ -1825,7 +1825,7 @@
               <a:graphicData uri="http://schemas.openxmlformats.org/drawingml/2006/picture">
                 <pic:pic xmlns:pic="http://schemas.openxmlformats.org/drawingml/2006/picture">
                   <pic:nvPicPr>
-                    <pic:cNvPr id="766921731" name=""/>
+                    <pic:cNvPr id="29242898" name=""/>
                     <pic:cNvPicPr/>
                   </pic:nvPicPr>
                   <pic:blipFill>
@@ -1843,7 +1843,7 @@
                   <pic:spPr>
                     <a:xfrm>
                       <a:off x="0" y="0"/>
-                      <a:ext cx="4716782" cy="343039"/>
+                      <a:ext cx="4715533" cy="342948"/>
                     </a:xfrm>
                     <a:prstGeom prst="rect">
                       <a:avLst/>
@@ -1961,10 +1961,10 @@
           <w:noProof/>
         </w:rPr>
         <w:drawing>
-          <wp:inline distT="0" distB="0" distL="0" distR="0" wp14:anchorId="2BB50834" wp14:editId="571B76FE">
+          <wp:inline distT="0" distB="0" distL="0" distR="0" wp14:anchorId="1F7A73F5" wp14:editId="7D3A1E66">
             <wp:extent cx="5274310" cy="3340100"/>
             <wp:effectExtent l="0" t="0" r="2540" b="0"/>
-            <wp:docPr id="1249118331" name="Picture 10"/>
+            <wp:docPr id="1710437378" name="Picture 10"/>
             <wp:cNvGraphicFramePr>
               <a:graphicFrameLocks xmlns:a="http://schemas.openxmlformats.org/drawingml/2006/main" noChangeAspect="1"/>
             </wp:cNvGraphicFramePr>
@@ -1972,7 +1972,7 @@
               <a:graphicData uri="http://schemas.openxmlformats.org/drawingml/2006/picture">
                 <pic:pic xmlns:pic="http://schemas.openxmlformats.org/drawingml/2006/picture">
                   <pic:nvPicPr>
-                    <pic:cNvPr id="1249118331" name=""/>
+                    <pic:cNvPr id="1710437378" name=""/>
                     <pic:cNvPicPr/>
                   </pic:nvPicPr>
                   <pic:blipFill>
@@ -2095,10 +2095,10 @@
           <w:noProof/>
         </w:rPr>
         <w:drawing>
-          <wp:inline distT="0" distB="0" distL="0" distR="0" wp14:anchorId="2C53A0FB" wp14:editId="08F26BBA">
-            <wp:extent cx="5274310" cy="147320"/>
-            <wp:effectExtent l="0" t="0" r="2540" b="5080"/>
-            <wp:docPr id="994838934" name="Picture 11"/>
+          <wp:inline distT="0" distB="0" distL="0" distR="0" wp14:anchorId="5128EF3B" wp14:editId="43D92A57">
+            <wp:extent cx="5274310" cy="147955"/>
+            <wp:effectExtent l="0" t="0" r="2540" b="4445"/>
+            <wp:docPr id="867001233" name="Picture 11"/>
             <wp:cNvGraphicFramePr>
               <a:graphicFrameLocks xmlns:a="http://schemas.openxmlformats.org/drawingml/2006/main" noChangeAspect="1"/>
             </wp:cNvGraphicFramePr>
@@ -2106,7 +2106,7 @@
               <a:graphicData uri="http://schemas.openxmlformats.org/drawingml/2006/picture">
                 <pic:pic xmlns:pic="http://schemas.openxmlformats.org/drawingml/2006/picture">
                   <pic:nvPicPr>
-                    <pic:cNvPr id="994838934" name=""/>
+                    <pic:cNvPr id="867001233" name=""/>
                     <pic:cNvPicPr/>
                   </pic:nvPicPr>
                   <pic:blipFill>
@@ -2124,7 +2124,7 @@
                   <pic:spPr>
                     <a:xfrm>
                       <a:off x="0" y="0"/>
-                      <a:ext cx="5274310" cy="147320"/>
+                      <a:ext cx="5274310" cy="147955"/>
                     </a:xfrm>
                     <a:prstGeom prst="rect">
                       <a:avLst/>
@@ -2247,10 +2247,10 @@
         </w:rPr>
         <w:lastRenderedPageBreak/>
         <w:drawing>
-          <wp:inline distT="0" distB="0" distL="0" distR="0" wp14:anchorId="4C4E7411" wp14:editId="62F26AA7">
+          <wp:inline distT="0" distB="0" distL="0" distR="0" wp14:anchorId="59678B08" wp14:editId="3CFCA881">
             <wp:extent cx="5274310" cy="3340100"/>
             <wp:effectExtent l="0" t="0" r="2540" b="0"/>
-            <wp:docPr id="113729504" name="Picture 12"/>
+            <wp:docPr id="1404429978" name="Picture 12"/>
             <wp:cNvGraphicFramePr>
               <a:graphicFrameLocks xmlns:a="http://schemas.openxmlformats.org/drawingml/2006/main" noChangeAspect="1"/>
             </wp:cNvGraphicFramePr>
@@ -2258,7 +2258,7 @@
               <a:graphicData uri="http://schemas.openxmlformats.org/drawingml/2006/picture">
                 <pic:pic xmlns:pic="http://schemas.openxmlformats.org/drawingml/2006/picture">
                   <pic:nvPicPr>
-                    <pic:cNvPr id="113729504" name=""/>
+                    <pic:cNvPr id="1404429978" name=""/>
                     <pic:cNvPicPr/>
                   </pic:nvPicPr>
                   <pic:blipFill>
@@ -2433,10 +2433,10 @@
           <w:noProof/>
         </w:rPr>
         <w:drawing>
-          <wp:inline distT="0" distB="0" distL="0" distR="0" wp14:anchorId="1D95ED9A" wp14:editId="03FB9F06">
+          <wp:inline distT="0" distB="0" distL="0" distR="0" wp14:anchorId="3A0B9D03" wp14:editId="54C4578D">
             <wp:extent cx="5274310" cy="277495"/>
             <wp:effectExtent l="0" t="0" r="2540" b="8255"/>
-            <wp:docPr id="1295888976" name="Picture 13"/>
+            <wp:docPr id="1329983512" name="Picture 13"/>
             <wp:cNvGraphicFramePr>
               <a:graphicFrameLocks xmlns:a="http://schemas.openxmlformats.org/drawingml/2006/main" noChangeAspect="1"/>
             </wp:cNvGraphicFramePr>
@@ -2444,7 +2444,7 @@
               <a:graphicData uri="http://schemas.openxmlformats.org/drawingml/2006/picture">
                 <pic:pic xmlns:pic="http://schemas.openxmlformats.org/drawingml/2006/picture">
                   <pic:nvPicPr>
-                    <pic:cNvPr id="1295888976" name=""/>
+                    <pic:cNvPr id="1329983512" name=""/>
                     <pic:cNvPicPr/>
                   </pic:nvPicPr>
                   <pic:blipFill>
@@ -2735,7 +2735,7 @@
   <w:abstractNum w:abstractNumId="0" w15:restartNumberingAfterBreak="0">
     <w:nsid w:val="FFFFFF89"/>
     <w:multiLevelType w:val="singleLevel"/>
-    <w:tmpl w:val="FCEC9204"/>
+    <w:tmpl w:val="0D5A7DBE"/>
     <w:lvl w:ilvl="0">
       <w:start w:val="1"/>
       <w:numFmt w:val="bullet"/>
@@ -2753,7 +2753,7 @@
       </w:rPr>
     </w:lvl>
   </w:abstractNum>
-  <w:num w:numId="1" w16cid:durableId="1911033549">
+  <w:num w:numId="1" w16cid:durableId="921715028">
     <w:abstractNumId w:val="0"/>
   </w:num>
 </w:numbering>
@@ -3167,7 +3167,7 @@
     <w:link w:val="Heading1Char"/>
     <w:uiPriority w:val="9"/>
     <w:qFormat/>
-    <w:rsid w:val="005A7CAD"/>
+    <w:rsid w:val="00E43FDB"/>
     <w:pPr>
       <w:keepNext/>
       <w:keepLines/>
@@ -3189,7 +3189,7 @@
     <w:uiPriority w:val="9"/>
     <w:unhideWhenUsed/>
     <w:qFormat/>
-    <w:rsid w:val="005A7CAD"/>
+    <w:rsid w:val="00E43FDB"/>
     <w:pPr>
       <w:keepNext/>
       <w:keepLines/>
@@ -3211,7 +3211,7 @@
     <w:uiPriority w:val="9"/>
     <w:unhideWhenUsed/>
     <w:qFormat/>
-    <w:rsid w:val="005A7CAD"/>
+    <w:rsid w:val="00E43FDB"/>
     <w:pPr>
       <w:keepNext/>
       <w:keepLines/>
@@ -3234,7 +3234,7 @@
     <w:semiHidden/>
     <w:unhideWhenUsed/>
     <w:qFormat/>
-    <w:rsid w:val="005A7CAD"/>
+    <w:rsid w:val="00E43FDB"/>
     <w:pPr>
       <w:keepNext/>
       <w:keepLines/>
@@ -3257,7 +3257,7 @@
     <w:semiHidden/>
     <w:unhideWhenUsed/>
     <w:qFormat/>
-    <w:rsid w:val="005A7CAD"/>
+    <w:rsid w:val="00E43FDB"/>
     <w:pPr>
       <w:keepNext/>
       <w:keepLines/>
@@ -3278,7 +3278,7 @@
     <w:semiHidden/>
     <w:unhideWhenUsed/>
     <w:qFormat/>
-    <w:rsid w:val="005A7CAD"/>
+    <w:rsid w:val="00E43FDB"/>
     <w:pPr>
       <w:keepNext/>
       <w:keepLines/>
@@ -3301,7 +3301,7 @@
     <w:semiHidden/>
     <w:unhideWhenUsed/>
     <w:qFormat/>
-    <w:rsid w:val="005A7CAD"/>
+    <w:rsid w:val="00E43FDB"/>
     <w:pPr>
       <w:keepNext/>
       <w:keepLines/>
@@ -3322,7 +3322,7 @@
     <w:semiHidden/>
     <w:unhideWhenUsed/>
     <w:qFormat/>
-    <w:rsid w:val="005A7CAD"/>
+    <w:rsid w:val="00E43FDB"/>
     <w:pPr>
       <w:keepNext/>
       <w:keepLines/>
@@ -3345,7 +3345,7 @@
     <w:semiHidden/>
     <w:unhideWhenUsed/>
     <w:qFormat/>
-    <w:rsid w:val="005A7CAD"/>
+    <w:rsid w:val="00E43FDB"/>
     <w:pPr>
       <w:keepNext/>
       <w:keepLines/>
@@ -3389,7 +3389,7 @@
     <w:basedOn w:val="DefaultParagraphFont"/>
     <w:link w:val="Heading1"/>
     <w:uiPriority w:val="9"/>
-    <w:rsid w:val="005A7CAD"/>
+    <w:rsid w:val="00E43FDB"/>
     <w:rPr>
       <w:rFonts w:asciiTheme="majorHAnsi" w:eastAsiaTheme="majorEastAsia" w:hAnsiTheme="majorHAnsi" w:cstheme="majorBidi"/>
       <w:color w:val="0F4761" w:themeColor="accent1" w:themeShade="BF"/>
@@ -3402,7 +3402,7 @@
     <w:basedOn w:val="DefaultParagraphFont"/>
     <w:link w:val="Heading2"/>
     <w:uiPriority w:val="9"/>
-    <w:rsid w:val="005A7CAD"/>
+    <w:rsid w:val="00E43FDB"/>
     <w:rPr>
       <w:rFonts w:asciiTheme="majorHAnsi" w:eastAsiaTheme="majorEastAsia" w:hAnsiTheme="majorHAnsi" w:cstheme="majorBidi"/>
       <w:color w:val="0F4761" w:themeColor="accent1" w:themeShade="BF"/>
@@ -3415,7 +3415,7 @@
     <w:basedOn w:val="DefaultParagraphFont"/>
     <w:link w:val="Heading3"/>
     <w:uiPriority w:val="9"/>
-    <w:rsid w:val="005A7CAD"/>
+    <w:rsid w:val="00E43FDB"/>
     <w:rPr>
       <w:rFonts w:eastAsiaTheme="majorEastAsia" w:cstheme="majorBidi"/>
       <w:color w:val="0F4761" w:themeColor="accent1" w:themeShade="BF"/>
@@ -3429,7 +3429,7 @@
     <w:link w:val="Heading4"/>
     <w:uiPriority w:val="9"/>
     <w:semiHidden/>
-    <w:rsid w:val="005A7CAD"/>
+    <w:rsid w:val="00E43FDB"/>
     <w:rPr>
       <w:rFonts w:eastAsiaTheme="majorEastAsia" w:cstheme="majorBidi"/>
       <w:i/>
@@ -3443,7 +3443,7 @@
     <w:link w:val="Heading5"/>
     <w:uiPriority w:val="9"/>
     <w:semiHidden/>
-    <w:rsid w:val="005A7CAD"/>
+    <w:rsid w:val="00E43FDB"/>
     <w:rPr>
       <w:rFonts w:eastAsiaTheme="majorEastAsia" w:cstheme="majorBidi"/>
       <w:color w:val="0F4761" w:themeColor="accent1" w:themeShade="BF"/>
@@ -3455,7 +3455,7 @@
     <w:link w:val="Heading6"/>
     <w:uiPriority w:val="9"/>
     <w:semiHidden/>
-    <w:rsid w:val="005A7CAD"/>
+    <w:rsid w:val="00E43FDB"/>
     <w:rPr>
       <w:rFonts w:eastAsiaTheme="majorEastAsia" w:cstheme="majorBidi"/>
       <w:i/>
@@ -3469,7 +3469,7 @@
     <w:link w:val="Heading7"/>
     <w:uiPriority w:val="9"/>
     <w:semiHidden/>
-    <w:rsid w:val="005A7CAD"/>
+    <w:rsid w:val="00E43FDB"/>
     <w:rPr>
       <w:rFonts w:eastAsiaTheme="majorEastAsia" w:cstheme="majorBidi"/>
       <w:color w:val="595959" w:themeColor="text1" w:themeTint="A6"/>
@@ -3481,7 +3481,7 @@
     <w:link w:val="Heading8"/>
     <w:uiPriority w:val="9"/>
     <w:semiHidden/>
-    <w:rsid w:val="005A7CAD"/>
+    <w:rsid w:val="00E43FDB"/>
     <w:rPr>
       <w:rFonts w:eastAsiaTheme="majorEastAsia" w:cstheme="majorBidi"/>
       <w:i/>
@@ -3495,7 +3495,7 @@
     <w:link w:val="Heading9"/>
     <w:uiPriority w:val="9"/>
     <w:semiHidden/>
-    <w:rsid w:val="005A7CAD"/>
+    <w:rsid w:val="00E43FDB"/>
     <w:rPr>
       <w:rFonts w:eastAsiaTheme="majorEastAsia" w:cstheme="majorBidi"/>
       <w:color w:val="272727" w:themeColor="text1" w:themeTint="D8"/>
@@ -3508,7 +3508,7 @@
     <w:link w:val="TitleChar"/>
     <w:uiPriority w:val="10"/>
     <w:qFormat/>
-    <w:rsid w:val="005A7CAD"/>
+    <w:rsid w:val="00E43FDB"/>
     <w:pPr>
       <w:spacing w:after="80" w:line="240" w:lineRule="auto"/>
       <w:contextualSpacing/>
@@ -3526,7 +3526,7 @@
     <w:basedOn w:val="DefaultParagraphFont"/>
     <w:link w:val="Title"/>
     <w:uiPriority w:val="10"/>
-    <w:rsid w:val="005A7CAD"/>
+    <w:rsid w:val="00E43FDB"/>
     <w:rPr>
       <w:rFonts w:asciiTheme="majorHAnsi" w:eastAsiaTheme="majorEastAsia" w:hAnsiTheme="majorHAnsi" w:cstheme="majorBidi"/>
       <w:spacing w:val="-10"/>
@@ -3542,7 +3542,7 @@
     <w:link w:val="SubtitleChar"/>
     <w:uiPriority w:val="11"/>
     <w:qFormat/>
-    <w:rsid w:val="005A7CAD"/>
+    <w:rsid w:val="00E43FDB"/>
     <w:pPr>
       <w:numPr>
         <w:ilvl w:val="1"/>
@@ -3561,7 +3561,7 @@
     <w:basedOn w:val="DefaultParagraphFont"/>
     <w:link w:val="Subtitle"/>
     <w:uiPriority w:val="11"/>
-    <w:rsid w:val="005A7CAD"/>
+    <w:rsid w:val="00E43FDB"/>
     <w:rPr>
       <w:rFonts w:eastAsiaTheme="majorEastAsia" w:cstheme="majorBidi"/>
       <w:color w:val="595959" w:themeColor="text1" w:themeTint="A6"/>
@@ -3577,7 +3577,7 @@
     <w:link w:val="QuoteChar"/>
     <w:uiPriority w:val="29"/>
     <w:qFormat/>
-    <w:rsid w:val="005A7CAD"/>
+    <w:rsid w:val="00E43FDB"/>
     <w:pPr>
       <w:spacing w:before="160"/>
       <w:jc w:val="center"/>
@@ -3593,7 +3593,7 @@
     <w:basedOn w:val="DefaultParagraphFont"/>
     <w:link w:val="Quote"/>
     <w:uiPriority w:val="29"/>
-    <w:rsid w:val="005A7CAD"/>
+    <w:rsid w:val="00E43FDB"/>
     <w:rPr>
       <w:i/>
       <w:iCs/>
@@ -3605,7 +3605,7 @@
     <w:basedOn w:val="Normal"/>
     <w:uiPriority w:val="34"/>
     <w:qFormat/>
-    <w:rsid w:val="005A7CAD"/>
+    <w:rsid w:val="00E43FDB"/>
     <w:pPr>
       <w:ind w:left="720"/>
       <w:contextualSpacing/>
@@ -3616,7 +3616,7 @@
     <w:basedOn w:val="DefaultParagraphFont"/>
     <w:uiPriority w:val="21"/>
     <w:qFormat/>
-    <w:rsid w:val="005A7CAD"/>
+    <w:rsid w:val="00E43FDB"/>
     <w:rPr>
       <w:i/>
       <w:iCs/>
@@ -3630,7 +3630,7 @@
     <w:link w:val="IntenseQuoteChar"/>
     <w:uiPriority w:val="30"/>
     <w:qFormat/>
-    <w:rsid w:val="005A7CAD"/>
+    <w:rsid w:val="00E43FDB"/>
     <w:pPr>
       <w:pBdr>
         <w:top w:val="single" w:sz="4" w:space="10" w:color="0F4761" w:themeColor="accent1" w:themeShade="BF"/>
@@ -3651,7 +3651,7 @@
     <w:basedOn w:val="DefaultParagraphFont"/>
     <w:link w:val="IntenseQuote"/>
     <w:uiPriority w:val="30"/>
-    <w:rsid w:val="005A7CAD"/>
+    <w:rsid w:val="00E43FDB"/>
     <w:rPr>
       <w:i/>
       <w:iCs/>
@@ -3663,7 +3663,7 @@
     <w:basedOn w:val="DefaultParagraphFont"/>
     <w:uiPriority w:val="32"/>
     <w:qFormat/>
-    <w:rsid w:val="005A7CAD"/>
+    <w:rsid w:val="00E43FDB"/>
     <w:rPr>
       <w:b/>
       <w:bCs/>
@@ -3677,7 +3677,7 @@
     <w:basedOn w:val="Normal"/>
     <w:uiPriority w:val="99"/>
     <w:unhideWhenUsed/>
-    <w:rsid w:val="005A7CAD"/>
+    <w:rsid w:val="00E43FDB"/>
     <w:pPr>
       <w:numPr>
         <w:numId w:val="1"/>

</xml_diff>